<commit_message>
mise à jour config
</commit_message>
<xml_diff>
--- a/template-doc-pbib.docx
+++ b/template-doc-pbib.docx
@@ -5,11 +5,57 @@
     <w:p>
       <w:pPr>
         <w:pStyle w:val="Titre"/>
+        <w:ind w:firstLine="0"/>
+        <w:jc w:val="left"/>
       </w:pPr>
     </w:p>
     <w:p>
       <w:pPr>
         <w:pStyle w:val="Titre"/>
+        <w:ind w:firstLine="0"/>
+        <w:jc w:val="left"/>
+      </w:pPr>
+    </w:p>
+    <w:p>
+      <w:pPr>
+        <w:pStyle w:val="Titre"/>
+        <w:ind w:firstLine="0"/>
+        <w:jc w:val="center"/>
+      </w:pPr>
+    </w:p>
+    <w:p>
+      <w:pPr>
+        <w:pStyle w:val="Titre"/>
+        <w:ind w:firstLine="0"/>
+        <w:jc w:val="center"/>
+      </w:pPr>
+    </w:p>
+    <w:p>
+      <w:pPr>
+        <w:pStyle w:val="Titre"/>
+        <w:ind w:firstLine="0"/>
+        <w:jc w:val="center"/>
+      </w:pPr>
+    </w:p>
+    <w:p>
+      <w:pPr>
+        <w:pStyle w:val="Titre"/>
+        <w:ind w:firstLine="0"/>
+        <w:jc w:val="center"/>
+      </w:pPr>
+    </w:p>
+    <w:p>
+      <w:pPr>
+        <w:pStyle w:val="Titre"/>
+        <w:ind w:firstLine="0"/>
+        <w:jc w:val="center"/>
+      </w:pPr>
+    </w:p>
+    <w:p>
+      <w:pPr>
+        <w:pStyle w:val="Titre"/>
+        <w:ind w:firstLine="0"/>
+        <w:jc w:val="center"/>
         <w:sectPr>
           <w:headerReference w:type="default" r:id="rId7"/>
           <w:footerReference w:type="default" r:id="rId8"/>
@@ -21,112 +67,6 @@
           <w:titlePg/>
         </w:sectPr>
       </w:pPr>
-      <w:r>
-        <w:rPr>
-          <w:noProof/>
-          <w:lang w:eastAsia="fr-FR"/>
-        </w:rPr>
-        <mc:AlternateContent>
-          <mc:Choice Requires="wps">
-            <w:drawing>
-              <wp:anchor distT="0" distB="0" distL="114300" distR="114300" simplePos="0" relativeHeight="251659264" behindDoc="0" locked="0" layoutInCell="1" allowOverlap="1" wp14:anchorId="6423D88C" wp14:editId="4E375A8F">
-                <wp:simplePos x="0" y="0"/>
-                <wp:positionH relativeFrom="margin">
-                  <wp:align>center</wp:align>
-                </wp:positionH>
-                <wp:positionV relativeFrom="margin">
-                  <wp:align>bottom</wp:align>
-                </wp:positionV>
-                <wp:extent cx="6306187" cy="7249792"/>
-                <wp:effectExtent l="0" t="0" r="18413" b="27308"/>
-                <wp:wrapSquare wrapText="bothSides"/>
-                <wp:docPr id="1507866145" name="Rectangle 200"/>
-                <wp:cNvGraphicFramePr/>
-                <a:graphic xmlns:a="http://schemas.openxmlformats.org/drawingml/2006/main">
-                  <a:graphicData uri="http://schemas.microsoft.com/office/word/2010/wordprocessingShape">
-                    <wps:wsp>
-                      <wps:cNvSpPr/>
-                      <wps:spPr>
-                        <a:xfrm>
-                          <a:off x="0" y="0"/>
-                          <a:ext cx="6306187" cy="7249792"/>
-                        </a:xfrm>
-                        <a:prstGeom prst="rect">
-                          <a:avLst/>
-                        </a:prstGeom>
-                        <a:solidFill>
-                          <a:srgbClr val="6D6F72"/>
-                        </a:solidFill>
-                        <a:ln w="12701" cap="flat">
-                          <a:solidFill>
-                            <a:srgbClr val="006297"/>
-                          </a:solidFill>
-                          <a:prstDash val="solid"/>
-                          <a:miter/>
-                        </a:ln>
-                      </wps:spPr>
-                      <wps:txbx>
-                        <w:txbxContent>
-                          <w:p>
-                            <w:pPr>
-                              <w:jc w:val="center"/>
-                              <w:rPr>
-                                <w:color w:val="FFFFFF"/>
-                                <w:sz w:val="96"/>
-                                <w:szCs w:val="96"/>
-                              </w:rPr>
-                            </w:pPr>
-                            <w:r>
-                              <w:rPr>
-                                <w:color w:val="FFFFFF"/>
-                                <w:sz w:val="96"/>
-                                <w:szCs w:val="96"/>
-                              </w:rPr>
-                              <w:t>Visuel de couverture</w:t>
-                            </w:r>
-                          </w:p>
-                        </w:txbxContent>
-                      </wps:txbx>
-                      <wps:bodyPr vert="horz" wrap="square" lIns="91440" tIns="45720" rIns="91440" bIns="45720" anchor="ctr" anchorCtr="0" compatLnSpc="1">
-                        <a:noAutofit/>
-                      </wps:bodyPr>
-                    </wps:wsp>
-                  </a:graphicData>
-                </a:graphic>
-              </wp:anchor>
-            </w:drawing>
-          </mc:Choice>
-          <mc:Fallback>
-            <w:pict>
-              <v:rect w14:anchorId="6423D88C" id="Rectangle 200" o:spid="_x0000_s1026" style="position:absolute;left:0;text-align:left;margin-left:0;margin-top:0;width:496.55pt;height:570.85pt;z-index:251659264;visibility:visible;mso-wrap-style:square;mso-wrap-distance-left:9pt;mso-wrap-distance-top:0;mso-wrap-distance-right:9pt;mso-wrap-distance-bottom:0;mso-position-horizontal:center;mso-position-horizontal-relative:margin;mso-position-vertical:bottom;mso-position-vertical-relative:margin;v-text-anchor:middle" o:gfxdata="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" fillcolor="#6d6f72" strokecolor="#006297" strokeweight=".35281mm">
-                <v:textbox>
-                  <w:txbxContent>
-                    <w:p>
-                      <w:pPr>
-                        <w:jc w:val="center"/>
-                        <w:rPr>
-                          <w:color w:val="FFFFFF"/>
-                          <w:sz w:val="96"/>
-                          <w:szCs w:val="96"/>
-                        </w:rPr>
-                      </w:pPr>
-                      <w:r>
-                        <w:rPr>
-                          <w:color w:val="FFFFFF"/>
-                          <w:sz w:val="96"/>
-                          <w:szCs w:val="96"/>
-                        </w:rPr>
-                        <w:t>Visuel de couverture</w:t>
-                      </w:r>
-                    </w:p>
-                  </w:txbxContent>
-                </v:textbox>
-                <w10:wrap type="square" anchorx="margin" anchory="margin"/>
-              </v:rect>
-            </w:pict>
-          </mc:Fallback>
-        </mc:AlternateContent>
-      </w:r>
       <w:r>
         <w:t>Titr</w:t>
       </w:r>
@@ -206,7 +146,7 @@
       <w:rPr>
         <w:noProof/>
       </w:rPr>
-      <w:t>17/07/2026</w:t>
+      <w:t>29/07/2026</w:t>
     </w:r>
     <w:r>
       <w:fldChar w:fldCharType="end"/>
@@ -242,13 +182,6 @@
         <w:tab w:val="clear" w:pos="9072"/>
       </w:tabs>
     </w:pPr>
-    <w:r>
-      <w:t>Informations complémentaires</w:t>
-    </w:r>
-    <w:r>
-      <w:tab/>
-      <w:t xml:space="preserve"> </w:t>
-    </w:r>
   </w:p>
 </w:ftr>
 </file>
@@ -281,7 +214,7 @@
       <w:rPr>
         <w:noProof/>
       </w:rPr>
-      <w:t>17/07/2026</w:t>
+      <w:t>29/07/2026</w:t>
     </w:r>
     <w:r>
       <w:fldChar w:fldCharType="end"/>
@@ -425,55 +358,67 @@
     <w:r>
       <w:rPr>
         <w:noProof/>
-        <w:lang w:eastAsia="fr-FR"/>
       </w:rPr>
       <w:drawing>
-        <wp:anchor distT="0" distB="0" distL="114300" distR="114300" simplePos="0" relativeHeight="251664384" behindDoc="0" locked="0" layoutInCell="1" allowOverlap="1" wp14:anchorId="4F4CA180" wp14:editId="49DC7993">
+        <wp:anchor distT="0" distB="0" distL="114300" distR="114300" simplePos="0" relativeHeight="251675648" behindDoc="0" locked="0" layoutInCell="1" allowOverlap="1" wp14:anchorId="670AE296" wp14:editId="0530E3A7">
           <wp:simplePos x="0" y="0"/>
-          <wp:positionH relativeFrom="column">
-            <wp:posOffset>-424811</wp:posOffset>
+          <wp:positionH relativeFrom="margin">
+            <wp:posOffset>-414655</wp:posOffset>
           </wp:positionH>
           <wp:positionV relativeFrom="paragraph">
-            <wp:posOffset>-201296</wp:posOffset>
+            <wp:posOffset>-231141</wp:posOffset>
           </wp:positionV>
-          <wp:extent cx="2163442" cy="645795"/>
-          <wp:effectExtent l="0" t="0" r="8258" b="1905"/>
+          <wp:extent cx="2009775" cy="752475"/>
+          <wp:effectExtent l="0" t="0" r="0" b="0"/>
           <wp:wrapNone/>
-          <wp:docPr id="400004197" name="Image 27" descr="Eiffage_0072_01_colour_RGB"/>
-          <wp:cNvGraphicFramePr/>
+          <wp:docPr id="540481771" name="Image 6"/>
+          <wp:cNvGraphicFramePr>
+            <a:graphicFrameLocks xmlns:a="http://schemas.openxmlformats.org/drawingml/2006/main" noChangeAspect="1"/>
+          </wp:cNvGraphicFramePr>
           <a:graphic xmlns:a="http://schemas.openxmlformats.org/drawingml/2006/main">
             <a:graphicData uri="http://schemas.openxmlformats.org/drawingml/2006/picture">
               <pic:pic xmlns:pic="http://schemas.openxmlformats.org/drawingml/2006/picture">
                 <pic:nvPicPr>
-                  <pic:cNvPr id="0" name=""/>
-                  <pic:cNvPicPr/>
+                  <pic:cNvPr id="0" name="Picture 13"/>
+                  <pic:cNvPicPr>
+                    <a:picLocks noChangeAspect="1" noChangeArrowheads="1"/>
+                  </pic:cNvPicPr>
                 </pic:nvPicPr>
                 <pic:blipFill>
-                  <a:blip r:embed="rId1"/>
+                  <a:blip r:embed="rId1">
+                    <a:extLst>
+                      <a:ext uri="{28A0092B-C50C-407E-A947-70E740481C1C}">
+                        <a14:useLocalDpi xmlns:a14="http://schemas.microsoft.com/office/drawing/2010/main" val="0"/>
+                      </a:ext>
+                    </a:extLst>
+                  </a:blip>
                   <a:srcRect/>
                   <a:stretch>
                     <a:fillRect/>
                   </a:stretch>
                 </pic:blipFill>
-                <pic:spPr>
+                <pic:spPr bwMode="auto">
                   <a:xfrm>
                     <a:off x="0" y="0"/>
-                    <a:ext cx="2163442" cy="645795"/>
+                    <a:ext cx="2009775" cy="752475"/>
                   </a:xfrm>
                   <a:prstGeom prst="rect">
                     <a:avLst/>
                   </a:prstGeom>
-                  <a:solidFill>
-                    <a:srgbClr val="FFFFFF"/>
-                  </a:solidFill>
+                  <a:noFill/>
                   <a:ln>
                     <a:noFill/>
-                    <a:prstDash/>
                   </a:ln>
                 </pic:spPr>
               </pic:pic>
             </a:graphicData>
           </a:graphic>
+          <wp14:sizeRelH relativeFrom="page">
+            <wp14:pctWidth>0</wp14:pctWidth>
+          </wp14:sizeRelH>
+          <wp14:sizeRelV relativeFrom="page">
+            <wp14:pctHeight>0</wp14:pctHeight>
+          </wp14:sizeRelV>
         </wp:anchor>
       </w:drawing>
     </w:r>
@@ -483,15 +428,15 @@
         <w:lang w:eastAsia="fr-FR"/>
       </w:rPr>
       <w:drawing>
-        <wp:anchor distT="0" distB="0" distL="114300" distR="114300" simplePos="0" relativeHeight="251663360" behindDoc="1" locked="0" layoutInCell="1" allowOverlap="1" wp14:anchorId="2A30E095" wp14:editId="30248859">
+        <wp:anchor distT="0" distB="0" distL="114300" distR="114300" simplePos="0" relativeHeight="251663360" behindDoc="1" locked="0" layoutInCell="1" allowOverlap="1" wp14:anchorId="2A30E095" wp14:editId="6BFA5D10">
           <wp:simplePos x="0" y="0"/>
           <wp:positionH relativeFrom="column">
-            <wp:posOffset>6315395</wp:posOffset>
+            <wp:posOffset>6233795</wp:posOffset>
           </wp:positionH>
           <wp:positionV relativeFrom="paragraph">
-            <wp:posOffset>-163833</wp:posOffset>
+            <wp:posOffset>-164466</wp:posOffset>
           </wp:positionV>
-          <wp:extent cx="266703" cy="2200274"/>
+          <wp:extent cx="352351" cy="2906863"/>
           <wp:effectExtent l="0" t="0" r="0" b="0"/>
           <wp:wrapNone/>
           <wp:docPr id="1353820175" name="Image 28"/>
@@ -504,7 +449,9 @@
                   <pic:cNvPicPr/>
                 </pic:nvPicPr>
                 <pic:blipFill>
-                  <a:blip r:embed="rId2"/>
+                  <a:blip r:embed="rId2">
+                    <a:alphaModFix/>
+                  </a:blip>
                   <a:srcRect/>
                   <a:stretch>
                     <a:fillRect/>
@@ -513,7 +460,7 @@
                 <pic:spPr>
                   <a:xfrm>
                     <a:off x="0" y="0"/>
-                    <a:ext cx="266703" cy="2200274"/>
+                    <a:ext cx="361442" cy="2981867"/>
                   </a:xfrm>
                   <a:prstGeom prst="rect">
                     <a:avLst/>
@@ -527,6 +474,12 @@
               </pic:pic>
             </a:graphicData>
           </a:graphic>
+          <wp14:sizeRelH relativeFrom="margin">
+            <wp14:pctWidth>0</wp14:pctWidth>
+          </wp14:sizeRelH>
+          <wp14:sizeRelV relativeFrom="margin">
+            <wp14:pctHeight>0</wp14:pctHeight>
+          </wp14:sizeRelV>
         </wp:anchor>
       </w:drawing>
     </w:r>
@@ -536,7 +489,7 @@
         <w:lang w:eastAsia="fr-FR"/>
       </w:rPr>
       <w:drawing>
-        <wp:anchor distT="0" distB="0" distL="114300" distR="114300" simplePos="0" relativeHeight="251662336" behindDoc="0" locked="0" layoutInCell="1" allowOverlap="1" wp14:anchorId="048F9E78" wp14:editId="14BF16CC">
+        <wp:anchor distT="0" distB="0" distL="114300" distR="114300" simplePos="0" relativeHeight="251662336" behindDoc="0" locked="0" layoutInCell="1" allowOverlap="1" wp14:anchorId="048F9E78" wp14:editId="070DCFF3">
           <wp:simplePos x="0" y="0"/>
           <wp:positionH relativeFrom="margin">
             <wp:posOffset>7356476</wp:posOffset>
@@ -726,7 +679,7 @@
     <w:tmpl w:val="AB8EE37A"/>
     <w:lvl w:ilvl="0" w:tplc="7EC2672A">
       <w:numFmt w:val="bullet"/>
-      <w:pStyle w:val="ListBullet"/>
+      <w:pStyle w:val="Listepuces1"/>
       <w:lvlText w:val="-"/>
       <w:lvlJc w:val="left"/>
       <w:pPr>
@@ -2600,8 +2553,8 @@
       <w:shd w:val="clear" w:color="auto" w:fill="E8E8E8" w:themeFill="background2"/>
     </w:rPr>
   </w:style>
-  <w:style w:type="paragraph" w:customStyle="1" w:styleId="ListBullet">
-    <w:name w:val="List Bullet"/>
+  <w:style w:type="paragraph" w:customStyle="1" w:styleId="Listepuces1">
+    <w:name w:val="Liste à puces1"/>
     <w:basedOn w:val="Paragraphedeliste"/>
     <w:link w:val="ListBulletCar"/>
     <w:qFormat/>
@@ -2624,7 +2577,7 @@
   <w:style w:type="character" w:customStyle="1" w:styleId="ListBulletCar">
     <w:name w:val="List Bullet Car"/>
     <w:basedOn w:val="ParagraphedelisteCar"/>
-    <w:link w:val="ListBullet"/>
+    <w:link w:val="Listepuces1"/>
     <w:rsid w:val="005229B8"/>
     <w:rPr>
       <w:rFonts w:ascii="Arial" w:hAnsi="Arial"/>

</xml_diff>

<commit_message>
plan config architecture documentation docx
</commit_message>
<xml_diff>
--- a/template-doc-pbib.docx
+++ b/template-doc-pbib.docx
@@ -81,6 +81,9 @@
         <w:rPr>
           <w:b/>
           <w:iCs/>
+          <w:sz w:val="22"/>
+          <w:szCs w:val="22"/>
+          <w:lang w:eastAsia="en-US"/>
         </w:rPr>
         <w:id w:val="-904448223"/>
         <w:docPartObj>
@@ -93,9 +96,6 @@
           <w:b w:val="0"/>
           <w:bCs/>
           <w:iCs w:val="0"/>
-          <w:sz w:val="22"/>
-          <w:szCs w:val="22"/>
-          <w:lang w:eastAsia="en-US"/>
         </w:rPr>
       </w:sdtEndPr>
       <w:sdtContent>
@@ -959,7 +959,7 @@
       <w:rPr>
         <w:noProof/>
       </w:rPr>
-      <w:t>29/07/2026</w:t>
+      <w:t>30/07/2026</w:t>
     </w:r>
     <w:r>
       <w:fldChar w:fldCharType="end"/>
@@ -2487,7 +2487,7 @@
   <w:abstractNum w:abstractNumId="9" w15:restartNumberingAfterBreak="0">
     <w:nsid w:val="7DD3511D"/>
     <w:multiLevelType w:val="multilevel"/>
-    <w:tmpl w:val="875C5198"/>
+    <w:tmpl w:val="12C69AFA"/>
     <w:lvl w:ilvl="0">
       <w:start w:val="1"/>
       <w:numFmt w:val="decimal"/>
@@ -3878,6 +3878,34 @@
       <w:color w:val="666666"/>
     </w:rPr>
   </w:style>
+  <w:style w:type="paragraph" w:customStyle="1" w:styleId="Sous-titre3">
+    <w:name w:val="Sous-titre 3"/>
+    <w:basedOn w:val="Normal"/>
+    <w:link w:val="Sous-titre3Car"/>
+    <w:qFormat/>
+    <w:rsid w:val="00735CEC"/>
+    <w:rPr>
+      <w:b/>
+      <w:bCs/>
+      <w:color w:val="0070C0"/>
+      <w:sz w:val="28"/>
+      <w:szCs w:val="28"/>
+    </w:rPr>
+  </w:style>
+  <w:style w:type="character" w:customStyle="1" w:styleId="Sous-titre3Car">
+    <w:name w:val="Sous-titre 3 Car"/>
+    <w:basedOn w:val="Policepardfaut"/>
+    <w:link w:val="Sous-titre3"/>
+    <w:rsid w:val="00735CEC"/>
+    <w:rPr>
+      <w:rFonts w:ascii="Avenir Next LT Pro" w:hAnsi="Avenir Next LT Pro"/>
+      <w:b/>
+      <w:bCs/>
+      <w:color w:val="0070C0"/>
+      <w:sz w:val="28"/>
+      <w:szCs w:val="28"/>
+    </w:rPr>
+  </w:style>
 </w:styles>
 </file>
 

</xml_diff>

<commit_message>
TOC / en-tête / mention mesures
</commit_message>
<xml_diff>
--- a/template-doc-pbib.docx
+++ b/template-doc-pbib.docx
@@ -959,7 +959,7 @@
       <w:rPr>
         <w:noProof/>
       </w:rPr>
-      <w:t>30/07/2026</w:t>
+      <w:t>18/08/2026</w:t>
     </w:r>
     <w:r>
       <w:fldChar w:fldCharType="end"/>
@@ -3906,6 +3906,25 @@
       <w:szCs w:val="28"/>
     </w:rPr>
   </w:style>
+  <w:style w:type="paragraph" w:customStyle="1" w:styleId="NormalTable">
+    <w:name w:val="Normal Table"/>
+    <w:basedOn w:val="Normal"/>
+    <w:link w:val="NormalTableCar"/>
+    <w:qFormat/>
+    <w:rsid w:val="00FF481A"/>
+    <w:pPr>
+      <w:spacing w:before="240" w:line="360" w:lineRule="auto"/>
+    </w:pPr>
+  </w:style>
+  <w:style w:type="character" w:customStyle="1" w:styleId="NormalTableCar">
+    <w:name w:val="Normal Table Car"/>
+    <w:basedOn w:val="Policepardfaut"/>
+    <w:link w:val="NormalTable"/>
+    <w:rsid w:val="00FF481A"/>
+    <w:rPr>
+      <w:rFonts w:ascii="Avenir Next LT Pro" w:hAnsi="Avenir Next LT Pro"/>
+    </w:rPr>
+  </w:style>
 </w:styles>
 </file>
 

</xml_diff>

<commit_message>
finals adjusts for v1
</commit_message>
<xml_diff>
--- a/template-doc-pbib.docx
+++ b/template-doc-pbib.docx
@@ -959,7 +959,7 @@
       <w:rPr>
         <w:noProof/>
       </w:rPr>
-      <w:t>18/08/2026</w:t>
+      <w:t>30/07/2026</w:t>
     </w:r>
     <w:r>
       <w:fldChar w:fldCharType="end"/>
@@ -3906,23 +3906,236 @@
       <w:szCs w:val="28"/>
     </w:rPr>
   </w:style>
-  <w:style w:type="paragraph" w:customStyle="1" w:styleId="NormalTable">
-    <w:name w:val="Normal Table"/>
-    <w:basedOn w:val="Normal"/>
-    <w:link w:val="NormalTableCar"/>
+  <w:style w:type="table" w:customStyle="1" w:styleId="TableauReference">
+    <w:name w:val="Tableau Reference"/>
+    <w:basedOn w:val="TableauNormal"/>
+    <w:uiPriority w:val="1"/>
     <w:qFormat/>
-    <w:rsid w:val="00FF481A"/>
-    <w:pPr>
-      <w:spacing w:before="240" w:line="360" w:lineRule="auto"/>
-    </w:pPr>
-  </w:style>
-  <w:style w:type="character" w:customStyle="1" w:styleId="NormalTableCar">
-    <w:name w:val="Normal Table Car"/>
-    <w:basedOn w:val="Policepardfaut"/>
-    <w:link w:val="NormalTable"/>
-    <w:rsid w:val="00FF481A"/>
+    <w:pPr>
+      <w:spacing w:before="0" w:after="0" w:line="240" w:lineRule="auto"/>
+    </w:pPr>
     <w:rPr>
       <w:rFonts w:ascii="Avenir Next LT Pro" w:hAnsi="Avenir Next LT Pro"/>
+      <w:sz w:val="20"/>
+      <w:szCs w:val="20"/>
+    </w:rPr>
+    <w:tblPr>
+      <w:tblStyleRowBandSize w:val="1"/>
+      <w:tblInd w:w="0" w:type="dxa"/>
+      <w:tblBorders>
+        <w:top w:val="single" w:sz="8" w:space="0" w:color="0070C0"/>
+        <w:bottom w:val="single" w:sz="8" w:space="0" w:color="0070C0"/>
+        <w:insideH w:val="single" w:sz="2" w:space="0" w:color="D9D9D9"/>
+      </w:tblBorders>
+      <w:tblCellMar>
+        <w:top w:w="68" w:type="dxa"/>
+        <w:left w:w="113" w:type="dxa"/>
+        <w:bottom w:w="68" w:type="dxa"/>
+        <w:right w:w="113" w:type="dxa"/>
+      </w:tblCellMar>
+    </w:tblPr>
+    <w:tblStylePr w:type="firstRow">
+      <w:pPr>
+        <w:spacing w:before="0" w:after="0"/>
+      </w:pPr>
+      <w:rPr>
+        <w:b/>
+        <w:caps/>
+        <w:color w:val="FFFFFF"/>
+        <w:spacing w:val="12"/>
+        <w:sz w:val="17"/>
+        <w:szCs w:val="17"/>
+      </w:rPr>
+      <w:tblPr/>
+      <w:tcPr>
+        <w:shd w:val="clear" w:color="auto" w:fill="0070C0"/>
+        <w:vAlign w:val="center"/>
+      </w:tcPr>
+    </w:tblStylePr>
+    <w:tblStylePr w:type="band1Horz">
+      <w:tblPr/>
+      <w:tcPr>
+        <w:shd w:val="clear" w:color="auto" w:fill="EAF3FB"/>
+      </w:tcPr>
+    </w:tblStylePr>
+  </w:style>
+  <w:style w:type="table" w:customStyle="1" w:styleId="TableauDonnees">
+    <w:name w:val="Tableau Donnees"/>
+    <w:basedOn w:val="TableauNormal"/>
+    <w:uiPriority w:val="2"/>
+    <w:qFormat/>
+    <w:pPr>
+      <w:spacing w:before="0" w:after="0" w:line="240" w:lineRule="auto"/>
+    </w:pPr>
+    <w:rPr>
+      <w:rFonts w:ascii="Avenir Next LT Pro" w:hAnsi="Avenir Next LT Pro"/>
+      <w:sz w:val="20"/>
+      <w:szCs w:val="20"/>
+    </w:rPr>
+    <w:tblPr>
+      <w:tblStyleRowBandSize w:val="1"/>
+      <w:tblInd w:w="0" w:type="dxa"/>
+      <w:tblBorders>
+        <w:top w:val="single" w:sz="6" w:space="0" w:color="595959"/>
+        <w:bottom w:val="single" w:sz="6" w:space="0" w:color="595959"/>
+        <w:insideH w:val="single" w:sz="2" w:space="0" w:color="D9D9D9"/>
+      </w:tblBorders>
+      <w:tblCellMar>
+        <w:top w:w="68" w:type="dxa"/>
+        <w:left w:w="113" w:type="dxa"/>
+        <w:bottom w:w="68" w:type="dxa"/>
+        <w:right w:w="113" w:type="dxa"/>
+      </w:tblCellMar>
+    </w:tblPr>
+    <w:tblStylePr w:type="firstRow">
+      <w:rPr>
+        <w:b/>
+        <w:caps/>
+        <w:color w:val="262626"/>
+        <w:spacing w:val="12"/>
+        <w:sz w:val="17"/>
+        <w:szCs w:val="17"/>
+      </w:rPr>
+      <w:tblPr/>
+      <w:tcPr>
+        <w:shd w:val="clear" w:color="auto" w:fill="E8E8E8"/>
+        <w:vAlign w:val="center"/>
+      </w:tcPr>
+    </w:tblStylePr>
+    <w:tblStylePr w:type="band1Horz">
+      <w:tblPr/>
+      <w:tcPr>
+        <w:shd w:val="clear" w:color="auto" w:fill="F7F7F7"/>
+      </w:tcPr>
+    </w:tblStylePr>
+  </w:style>
+  <w:style w:type="paragraph" w:customStyle="1" w:styleId="RefEntete">
+    <w:name w:val="Ref Entete"/>
+    <w:basedOn w:val="Normal"/>
+    <w:qFormat/>
+    <w:pPr>
+      <w:spacing w:before="0" w:after="0" w:line="240" w:lineRule="auto"/>
+    </w:pPr>
+    <w:rPr>
+      <w:b/>
+      <w:caps/>
+      <w:color w:val="FFFFFF"/>
+      <w:spacing w:val="12"/>
+      <w:sz w:val="17"/>
+      <w:szCs w:val="17"/>
+    </w:rPr>
+  </w:style>
+  <w:style w:type="paragraph" w:customStyle="1" w:styleId="RefNumero">
+    <w:name w:val="Ref Numero"/>
+    <w:basedOn w:val="Normal"/>
+    <w:qFormat/>
+    <w:pPr>
+      <w:spacing w:before="0" w:after="0" w:line="240" w:lineRule="auto"/>
+      <w:jc w:val="center"/>
+    </w:pPr>
+    <w:rPr>
+      <w:b/>
+      <w:color w:val="0070C0"/>
+      <w:sz w:val="20"/>
+      <w:szCs w:val="20"/>
+    </w:rPr>
+  </w:style>
+  <w:style w:type="paragraph" w:customStyle="1" w:styleId="RefRole">
+    <w:name w:val="Ref Role"/>
+    <w:basedOn w:val="Normal"/>
+    <w:qFormat/>
+    <w:pPr>
+      <w:spacing w:before="0" w:after="0" w:line="240" w:lineRule="auto"/>
+    </w:pPr>
+    <w:rPr>
+      <w:smallCaps/>
+      <w:color w:val="595959"/>
+      <w:sz w:val="18"/>
+      <w:szCs w:val="18"/>
+    </w:rPr>
+  </w:style>
+  <w:style w:type="paragraph" w:customStyle="1" w:styleId="RefValeur">
+    <w:name w:val="Ref Valeur"/>
+    <w:basedOn w:val="Normal"/>
+    <w:qFormat/>
+    <w:pPr>
+      <w:spacing w:before="0" w:after="0" w:line="240" w:lineRule="auto"/>
+    </w:pPr>
+    <w:rPr>
+      <w:sz w:val="20"/>
+      <w:szCs w:val="20"/>
+    </w:rPr>
+  </w:style>
+  <w:style w:type="paragraph" w:customStyle="1" w:styleId="Legende">
+    <w:name w:val="Legende"/>
+    <w:basedOn w:val="Normal"/>
+    <w:next w:val="Normal"/>
+    <w:qFormat/>
+    <w:pPr>
+      <w:spacing w:before="60" w:after="240" w:line="240" w:lineRule="auto"/>
+      <w:jc w:val="center"/>
+    </w:pPr>
+    <w:rPr>
+      <w:i/>
+      <w:iCs/>
+      <w:color w:val="595959"/>
+      <w:sz w:val="18"/>
+      <w:szCs w:val="18"/>
+    </w:rPr>
+  </w:style>
+  <w:style w:type="paragraph" w:customStyle="1" w:styleId="ImagePlaceholder">
+    <w:name w:val="Image Placeholder"/>
+    <w:basedOn w:val="Normal"/>
+    <w:next w:val="Normal"/>
+    <w:qFormat/>
+    <w:pPr>
+      <w:pBdr>
+        <w:top w:val="dashed" w:sz="4" w:space="8" w:color="A6A6A6"/>
+        <w:left w:val="dashed" w:sz="4" w:space="8" w:color="A6A6A6"/>
+        <w:bottom w:val="dashed" w:sz="4" w:space="8" w:color="A6A6A6"/>
+        <w:right w:val="dashed" w:sz="4" w:space="8" w:color="A6A6A6"/>
+      </w:pBdr>
+      <w:shd w:val="clear" w:color="auto" w:fill="F7F7F7"/>
+      <w:spacing w:before="120" w:after="120" w:line="240" w:lineRule="auto"/>
+      <w:jc w:val="center"/>
+    </w:pPr>
+    <w:rPr>
+      <w:i/>
+      <w:iCs/>
+      <w:color w:val="808080"/>
+      <w:sz w:val="18"/>
+      <w:szCs w:val="18"/>
+    </w:rPr>
+  </w:style>
+  <w:style w:type="paragraph" w:customStyle="1" w:styleId="AComplete">
+    <w:name w:val="A completer"/>
+    <w:basedOn w:val="Normal"/>
+    <w:next w:val="Normal"/>
+    <w:qFormat/>
+    <w:pPr>
+      <w:pBdr>
+        <w:left w:val="single" w:sz="18" w:space="6" w:color="FFC000"/>
+      </w:pBdr>
+      <w:spacing w:before="60" w:after="120" w:line="240" w:lineRule="auto"/>
+      <w:ind w:left="142"/>
+    </w:pPr>
+    <w:rPr>
+      <w:i/>
+      <w:iCs/>
+      <w:color w:val="806000"/>
+      <w:sz w:val="20"/>
+      <w:szCs w:val="20"/>
+    </w:rPr>
+  </w:style>
+  <w:style w:type="character" w:customStyle="1" w:styleId="IdTechnique">
+    <w:name w:val="Id technique"/>
+    <w:basedOn w:val="Policepardfaut"/>
+    <w:qFormat/>
+    <w:rPr>
+      <w:rFonts w:ascii="Consolas" w:hAnsi="Consolas"/>
+      <w:color w:val="808080"/>
+      <w:sz w:val="16"/>
+      <w:szCs w:val="16"/>
     </w:rPr>
   </w:style>
 </w:styles>

</xml_diff>

<commit_message>
new template simplier, style uniquement
</commit_message>
<xml_diff>
--- a/template-doc-pbib.docx
+++ b/template-doc-pbib.docx
@@ -790,110 +790,17 @@
         </w:p>
       </w:sdtContent>
     </w:sdt>
-    <w:p/>
     <w:p>
       <w:pPr>
         <w:suppressAutoHyphens w:val="0"/>
         <w:spacing w:after="160" w:line="256" w:lineRule="auto"/>
       </w:pPr>
-      <w:r>
-        <w:br w:type="page"/>
-      </w:r>
     </w:p>
     <w:p>
       <w:pPr>
-        <w:pStyle w:val="Titre1"/>
-      </w:pPr>
-      <w:bookmarkStart w:id="1" w:name="_Toc236231224"/>
-      <w:r>
-        <w:lastRenderedPageBreak/>
-        <w:t>Initialisation</w:t>
-      </w:r>
-      <w:bookmarkEnd w:id="1"/>
-    </w:p>
-    <w:p/>
-    <w:p>
-      <w:pPr>
-        <w:pStyle w:val="Titre2"/>
-      </w:pPr>
-      <w:bookmarkStart w:id="2" w:name="_Toc236231225"/>
-      <w:r>
-        <w:t>Contexte</w:t>
-      </w:r>
-      <w:bookmarkEnd w:id="2"/>
-    </w:p>
-    <w:p/>
-    <w:p>
-      <w:pPr>
-        <w:pStyle w:val="Titre2"/>
-      </w:pPr>
-      <w:bookmarkStart w:id="3" w:name="_Toc236231226"/>
-      <w:r>
-        <w:t>Objet</w:t>
-      </w:r>
-      <w:bookmarkEnd w:id="3"/>
-    </w:p>
-    <w:p/>
-    <w:p>
-      <w:pPr>
-        <w:pStyle w:val="Titre2"/>
-      </w:pPr>
-      <w:bookmarkStart w:id="4" w:name="_Toc236231227"/>
-      <w:r>
-        <w:t>Objectif</w:t>
-      </w:r>
-      <w:bookmarkEnd w:id="4"/>
-    </w:p>
-    <w:p/>
-    <w:p>
-      <w:pPr>
-        <w:pStyle w:val="Titre2"/>
-      </w:pPr>
-      <w:bookmarkStart w:id="5" w:name="_Toc236231228"/>
-      <w:r>
-        <w:t>Acteurs</w:t>
-      </w:r>
-      <w:bookmarkEnd w:id="5"/>
-    </w:p>
-    <w:p/>
-    <w:p>
-      <w:pPr>
-        <w:pStyle w:val="Titre3"/>
-      </w:pPr>
-      <w:r>
-        <w:t>Parties Prenantes</w:t>
-      </w:r>
-    </w:p>
-    <w:p/>
-    <w:p>
-      <w:pPr>
-        <w:pStyle w:val="Titre3"/>
-      </w:pPr>
-      <w:r>
-        <w:t>Parties intéressées</w:t>
-      </w:r>
-    </w:p>
-    <w:p/>
-    <w:p>
-      <w:pPr>
-        <w:pStyle w:val="Titre2"/>
-      </w:pPr>
-      <w:bookmarkStart w:id="6" w:name="_Toc236231229"/>
-      <w:r>
-        <w:t>Périmètre</w:t>
-      </w:r>
-      <w:bookmarkEnd w:id="6"/>
-    </w:p>
-    <w:p/>
-    <w:p>
-      <w:pPr>
-        <w:pStyle w:val="Titre2"/>
-      </w:pPr>
-      <w:bookmarkStart w:id="7" w:name="_Toc236231230"/>
-      <w:r>
-        <w:t>Source</w:t>
-      </w:r>
-      <w:bookmarkEnd w:id="7"/>
+        <w:suppressAutoHyphens w:val="0"/>
+        <w:spacing w:after="160" w:line="256" w:lineRule="auto"/>
+      </w:pPr>
     </w:p>
     <w:sectPr>
       <w:headerReference w:type="default" r:id="rId12"/>
@@ -959,7 +866,7 @@
       <w:rPr>
         <w:noProof/>
       </w:rPr>
-      <w:t>18/08/2026</w:t>
+      <w:t>25/08/2026</w:t>
     </w:r>
     <w:r>
       <w:fldChar w:fldCharType="end"/>
@@ -3464,6 +3371,7 @@
   <w:style w:type="character" w:customStyle="1" w:styleId="Titre1Car">
     <w:name w:val="Titre 1 Car"/>
     <w:basedOn w:val="Policepardfaut"/>
+    <w:uiPriority w:val="9"/>
     <w:rPr>
       <w:rFonts w:ascii="Arial" w:hAnsi="Arial"/>
       <w:b/>
@@ -3474,6 +3382,7 @@
   <w:style w:type="character" w:customStyle="1" w:styleId="Titre2Car">
     <w:name w:val="Titre 2 Car"/>
     <w:basedOn w:val="Policepardfaut"/>
+    <w:uiPriority w:val="9"/>
     <w:rPr>
       <w:rFonts w:ascii="Arial" w:eastAsia="MS Mincho" w:hAnsi="Arial" w:cs="Times New Roman"/>
       <w:sz w:val="32"/>
@@ -3514,6 +3423,7 @@
   <w:style w:type="character" w:customStyle="1" w:styleId="Titre3Car">
     <w:name w:val="Titre 3 Car"/>
     <w:basedOn w:val="Policepardfaut"/>
+    <w:uiPriority w:val="9"/>
     <w:rPr>
       <w:rFonts w:ascii="Arial" w:eastAsia="MS Gothic" w:hAnsi="Arial" w:cs="Times New Roman"/>
       <w:b/>

</xml_diff>

<commit_message>
no page break in yaml (h1 in word already page break alone
</commit_message>
<xml_diff>
--- a/template-doc-pbib.docx
+++ b/template-doc-pbib.docx
@@ -1,6 +1,6 @@
 
 <file path=word/document.xml><?xml version="1.0" encoding="utf-8"?>
-<w:document xmlns:wpc="http://schemas.microsoft.com/office/word/2010/wordprocessingCanvas" xmlns:cx="http://schemas.microsoft.com/office/drawing/2014/chartex" xmlns:cx1="http://schemas.microsoft.com/office/drawing/2015/9/8/chartex" xmlns:cx2="http://schemas.microsoft.com/office/drawing/2015/10/21/chartex" xmlns:cx3="http://schemas.microsoft.com/office/drawing/2016/5/9/chartex" xmlns:cx4="http://schemas.microsoft.com/office/drawing/2016/5/10/chartex" xmlns:cx5="http://schemas.microsoft.com/office/drawing/2016/5/11/chartex" xmlns:cx6="http://schemas.microsoft.com/office/drawing/2016/5/12/chartex" xmlns:cx7="http://schemas.microsoft.com/office/drawing/2016/5/13/chartex" xmlns:cx8="http://schemas.microsoft.com/office/drawing/2016/5/14/chartex" xmlns:mc="http://schemas.openxmlformats.org/markup-compatibility/2006" xmlns:aink="http://schemas.microsoft.com/office/drawing/2016/ink" xmlns:am3d="http://schemas.microsoft.com/office/drawing/2017/model3d" xmlns:o="urn:schemas-microsoft-com:office:office" xmlns:oel="http://schemas.microsoft.com/office/2019/extlst" xmlns:r="http://schemas.openxmlformats.org/officeDocument/2006/relationships" xmlns:m="http://schemas.openxmlformats.org/officeDocument/2006/math" xmlns:v="urn:schemas-microsoft-com:vml" xmlns:wp14="http://schemas.microsoft.com/office/word/2010/wordprocessingDrawing" xmlns:wp="http://schemas.openxmlformats.org/drawingml/2006/wordprocessingDrawing" xmlns:w10="urn:schemas-microsoft-com:office:word" xmlns:w="http://schemas.openxmlformats.org/wordprocessingml/2006/main" xmlns:w14="http://schemas.microsoft.com/office/word/2010/wordml" xmlns:w15="http://schemas.microsoft.com/office/word/2012/wordml" xmlns:w16cex="http://schemas.microsoft.com/office/word/2018/wordml/cex" xmlns:w16cid="http://schemas.microsoft.com/office/word/2016/wordml/cid" xmlns:w16="http://schemas.microsoft.com/office/word/2018/wordml" xmlns:w16du="http://schemas.microsoft.com/office/word/2023/wordml/word16du" xmlns:w16sdtdh="http://schemas.microsoft.com/office/word/2020/wordml/sdtdatahash" xmlns:w16sdtfl="http://schemas.microsoft.com/office/word/2024/wordml/sdtformatlock" xmlns:w16se="http://schemas.microsoft.com/office/word/2015/wordml/symex" xmlns:wpg="http://schemas.microsoft.com/office/word/2010/wordprocessingGroup" xmlns:wpi="http://schemas.microsoft.com/office/word/2010/wordprocessingInk" xmlns:wne="http://schemas.microsoft.com/office/word/2006/wordml" xmlns:wps="http://schemas.microsoft.com/office/word/2010/wordprocessingShape" mc:Ignorable="w14 w15 w16se w16cid w16 w16cex w16sdtdh w16sdtfl w16du wp14">
+<w:document xmlns:wpc="http://schemas.microsoft.com/office/word/2010/wordprocessingCanvas" xmlns:cx="http://schemas.microsoft.com/office/drawing/2014/chartex" xmlns:cx1="http://schemas.microsoft.com/office/drawing/2015/9/8/chartex" xmlns:cx2="http://schemas.microsoft.com/office/drawing/2015/10/21/chartex" xmlns:cx3="http://schemas.microsoft.com/office/drawing/2016/5/9/chartex" xmlns:cx4="http://schemas.microsoft.com/office/drawing/2016/5/10/chartex" xmlns:cx5="http://schemas.microsoft.com/office/drawing/2016/5/11/chartex" xmlns:cx6="http://schemas.microsoft.com/office/drawing/2016/5/12/chartex" xmlns:cx7="http://schemas.microsoft.com/office/drawing/2016/5/13/chartex" xmlns:cx8="http://schemas.microsoft.com/office/drawing/2016/5/14/chartex" xmlns:mc="http://schemas.openxmlformats.org/markup-compatibility/2006" xmlns:aink="http://schemas.microsoft.com/office/drawing/2016/ink" xmlns:am3d="http://schemas.microsoft.com/office/drawing/2017/model3d" xmlns:o="urn:schemas-microsoft-com:office:office" xmlns:oel="http://schemas.microsoft.com/office/2019/extlst" xmlns:r="http://schemas.openxmlformats.org/officeDocument/2006/relationships" xmlns:m="http://schemas.openxmlformats.org/officeDocument/2006/math" xmlns:v="urn:schemas-microsoft-com:vml" xmlns:wp14="http://schemas.microsoft.com/office/word/2010/wordprocessingDrawing" xmlns:wp="http://schemas.openxmlformats.org/drawingml/2006/wordprocessingDrawing" xmlns:w10="urn:schemas-microsoft-com:office:word" xmlns:w="http://schemas.openxmlformats.org/wordprocessingml/2006/main" xmlns:w14="http://schemas.microsoft.com/office/word/2010/wordml" xmlns:w15="http://schemas.microsoft.com/office/word/2012/wordml" xmlns:w16cei="http://schemas.microsoft.com/office/word/2026/wordml/cei" xmlns:w16cex="http://schemas.microsoft.com/office/word/2018/wordml/cex" xmlns:w16cid="http://schemas.microsoft.com/office/word/2016/wordml/cid" xmlns:w16="http://schemas.microsoft.com/office/word/2018/wordml" xmlns:w16du="http://schemas.microsoft.com/office/word/2023/wordml/word16du" xmlns:w16sdtdh="http://schemas.microsoft.com/office/word/2020/wordml/sdtdatahash" xmlns:w16sdtfl="http://schemas.microsoft.com/office/word/2024/wordml/sdtformatlock" xmlns:w16se="http://schemas.microsoft.com/office/word/2015/wordml/symex" xmlns:wpg="http://schemas.microsoft.com/office/word/2010/wordprocessingGroup" xmlns:wpi="http://schemas.microsoft.com/office/word/2010/wordprocessingInk" xmlns:wne="http://schemas.microsoft.com/office/word/2006/wordml" xmlns:wps="http://schemas.microsoft.com/office/word/2010/wordprocessingShape" mc:Ignorable="w14 w15 w16se w16cid w16 w16cex w16sdtdh w16sdtfl w16du wp14">
   <w:body>
     <w:p>
       <w:pPr>
@@ -814,7 +814,7 @@
 </file>
 
 <file path=word/endnotes.xml><?xml version="1.0" encoding="utf-8"?>
-<w:endnotes xmlns:wpc="http://schemas.microsoft.com/office/word/2010/wordprocessingCanvas" xmlns:cx="http://schemas.microsoft.com/office/drawing/2014/chartex" xmlns:cx1="http://schemas.microsoft.com/office/drawing/2015/9/8/chartex" xmlns:cx2="http://schemas.microsoft.com/office/drawing/2015/10/21/chartex" xmlns:cx3="http://schemas.microsoft.com/office/drawing/2016/5/9/chartex" xmlns:cx4="http://schemas.microsoft.com/office/drawing/2016/5/10/chartex" xmlns:cx5="http://schemas.microsoft.com/office/drawing/2016/5/11/chartex" xmlns:cx6="http://schemas.microsoft.com/office/drawing/2016/5/12/chartex" xmlns:cx7="http://schemas.microsoft.com/office/drawing/2016/5/13/chartex" xmlns:cx8="http://schemas.microsoft.com/office/drawing/2016/5/14/chartex" xmlns:mc="http://schemas.openxmlformats.org/markup-compatibility/2006" xmlns:aink="http://schemas.microsoft.com/office/drawing/2016/ink" xmlns:am3d="http://schemas.microsoft.com/office/drawing/2017/model3d" xmlns:o="urn:schemas-microsoft-com:office:office" xmlns:oel="http://schemas.microsoft.com/office/2019/extlst" xmlns:r="http://schemas.openxmlformats.org/officeDocument/2006/relationships" xmlns:m="http://schemas.openxmlformats.org/officeDocument/2006/math" xmlns:v="urn:schemas-microsoft-com:vml" xmlns:wp14="http://schemas.microsoft.com/office/word/2010/wordprocessingDrawing" xmlns:wp="http://schemas.openxmlformats.org/drawingml/2006/wordprocessingDrawing" xmlns:w10="urn:schemas-microsoft-com:office:word" xmlns:w="http://schemas.openxmlformats.org/wordprocessingml/2006/main" xmlns:w14="http://schemas.microsoft.com/office/word/2010/wordml" xmlns:w15="http://schemas.microsoft.com/office/word/2012/wordml" xmlns:w16cex="http://schemas.microsoft.com/office/word/2018/wordml/cex" xmlns:w16cid="http://schemas.microsoft.com/office/word/2016/wordml/cid" xmlns:w16="http://schemas.microsoft.com/office/word/2018/wordml" xmlns:w16du="http://schemas.microsoft.com/office/word/2023/wordml/word16du" xmlns:w16sdtdh="http://schemas.microsoft.com/office/word/2020/wordml/sdtdatahash" xmlns:w16sdtfl="http://schemas.microsoft.com/office/word/2024/wordml/sdtformatlock" xmlns:w16se="http://schemas.microsoft.com/office/word/2015/wordml/symex" xmlns:wpg="http://schemas.microsoft.com/office/word/2010/wordprocessingGroup" xmlns:wpi="http://schemas.microsoft.com/office/word/2010/wordprocessingInk" xmlns:wne="http://schemas.microsoft.com/office/word/2006/wordml" xmlns:wps="http://schemas.microsoft.com/office/word/2010/wordprocessingShape" mc:Ignorable="w14 w15 w16se w16cid w16 w16cex w16sdtdh w16sdtfl w16du wp14">
+<w:endnotes xmlns:wpc="http://schemas.microsoft.com/office/word/2010/wordprocessingCanvas" xmlns:cx="http://schemas.microsoft.com/office/drawing/2014/chartex" xmlns:cx1="http://schemas.microsoft.com/office/drawing/2015/9/8/chartex" xmlns:cx2="http://schemas.microsoft.com/office/drawing/2015/10/21/chartex" xmlns:cx3="http://schemas.microsoft.com/office/drawing/2016/5/9/chartex" xmlns:cx4="http://schemas.microsoft.com/office/drawing/2016/5/10/chartex" xmlns:cx5="http://schemas.microsoft.com/office/drawing/2016/5/11/chartex" xmlns:cx6="http://schemas.microsoft.com/office/drawing/2016/5/12/chartex" xmlns:cx7="http://schemas.microsoft.com/office/drawing/2016/5/13/chartex" xmlns:cx8="http://schemas.microsoft.com/office/drawing/2016/5/14/chartex" xmlns:mc="http://schemas.openxmlformats.org/markup-compatibility/2006" xmlns:aink="http://schemas.microsoft.com/office/drawing/2016/ink" xmlns:am3d="http://schemas.microsoft.com/office/drawing/2017/model3d" xmlns:o="urn:schemas-microsoft-com:office:office" xmlns:oel="http://schemas.microsoft.com/office/2019/extlst" xmlns:r="http://schemas.openxmlformats.org/officeDocument/2006/relationships" xmlns:m="http://schemas.openxmlformats.org/officeDocument/2006/math" xmlns:v="urn:schemas-microsoft-com:vml" xmlns:wp14="http://schemas.microsoft.com/office/word/2010/wordprocessingDrawing" xmlns:wp="http://schemas.openxmlformats.org/drawingml/2006/wordprocessingDrawing" xmlns:w10="urn:schemas-microsoft-com:office:word" xmlns:w="http://schemas.openxmlformats.org/wordprocessingml/2006/main" xmlns:w14="http://schemas.microsoft.com/office/word/2010/wordml" xmlns:w15="http://schemas.microsoft.com/office/word/2012/wordml" xmlns:w16cei="http://schemas.microsoft.com/office/word/2026/wordml/cei" xmlns:w16cex="http://schemas.microsoft.com/office/word/2018/wordml/cex" xmlns:w16cid="http://schemas.microsoft.com/office/word/2016/wordml/cid" xmlns:w16="http://schemas.microsoft.com/office/word/2018/wordml" xmlns:w16du="http://schemas.microsoft.com/office/word/2023/wordml/word16du" xmlns:w16sdtdh="http://schemas.microsoft.com/office/word/2020/wordml/sdtdatahash" xmlns:w16sdtfl="http://schemas.microsoft.com/office/word/2024/wordml/sdtformatlock" xmlns:w16se="http://schemas.microsoft.com/office/word/2015/wordml/symex" xmlns:wpg="http://schemas.microsoft.com/office/word/2010/wordprocessingGroup" xmlns:wpi="http://schemas.microsoft.com/office/word/2010/wordprocessingInk" xmlns:wne="http://schemas.microsoft.com/office/word/2006/wordml" xmlns:wps="http://schemas.microsoft.com/office/word/2010/wordprocessingShape" mc:Ignorable="w14 w15 w16se w16cid w16 w16cex w16sdtdh w16sdtfl w16du wp14">
   <w:endnote w:type="separator" w:id="-1">
     <w:p>
       <w:pPr>
@@ -839,7 +839,7 @@
 </file>
 
 <file path=word/footer1.xml><?xml version="1.0" encoding="utf-8"?>
-<w:ftr xmlns:wpc="http://schemas.microsoft.com/office/word/2010/wordprocessingCanvas" xmlns:cx="http://schemas.microsoft.com/office/drawing/2014/chartex" xmlns:cx1="http://schemas.microsoft.com/office/drawing/2015/9/8/chartex" xmlns:cx2="http://schemas.microsoft.com/office/drawing/2015/10/21/chartex" xmlns:cx3="http://schemas.microsoft.com/office/drawing/2016/5/9/chartex" xmlns:cx4="http://schemas.microsoft.com/office/drawing/2016/5/10/chartex" xmlns:cx5="http://schemas.microsoft.com/office/drawing/2016/5/11/chartex" xmlns:cx6="http://schemas.microsoft.com/office/drawing/2016/5/12/chartex" xmlns:cx7="http://schemas.microsoft.com/office/drawing/2016/5/13/chartex" xmlns:cx8="http://schemas.microsoft.com/office/drawing/2016/5/14/chartex" xmlns:mc="http://schemas.openxmlformats.org/markup-compatibility/2006" xmlns:aink="http://schemas.microsoft.com/office/drawing/2016/ink" xmlns:am3d="http://schemas.microsoft.com/office/drawing/2017/model3d" xmlns:o="urn:schemas-microsoft-com:office:office" xmlns:oel="http://schemas.microsoft.com/office/2019/extlst" xmlns:r="http://schemas.openxmlformats.org/officeDocument/2006/relationships" xmlns:m="http://schemas.openxmlformats.org/officeDocument/2006/math" xmlns:v="urn:schemas-microsoft-com:vml" xmlns:wp14="http://schemas.microsoft.com/office/word/2010/wordprocessingDrawing" xmlns:wp="http://schemas.openxmlformats.org/drawingml/2006/wordprocessingDrawing" xmlns:w10="urn:schemas-microsoft-com:office:word" xmlns:w="http://schemas.openxmlformats.org/wordprocessingml/2006/main" xmlns:w14="http://schemas.microsoft.com/office/word/2010/wordml" xmlns:w15="http://schemas.microsoft.com/office/word/2012/wordml" xmlns:w16cex="http://schemas.microsoft.com/office/word/2018/wordml/cex" xmlns:w16cid="http://schemas.microsoft.com/office/word/2016/wordml/cid" xmlns:w16="http://schemas.microsoft.com/office/word/2018/wordml" xmlns:w16du="http://schemas.microsoft.com/office/word/2023/wordml/word16du" xmlns:w16sdtdh="http://schemas.microsoft.com/office/word/2020/wordml/sdtdatahash" xmlns:w16sdtfl="http://schemas.microsoft.com/office/word/2024/wordml/sdtformatlock" xmlns:w16se="http://schemas.microsoft.com/office/word/2015/wordml/symex" xmlns:wpg="http://schemas.microsoft.com/office/word/2010/wordprocessingGroup" xmlns:wpi="http://schemas.microsoft.com/office/word/2010/wordprocessingInk" xmlns:wne="http://schemas.microsoft.com/office/word/2006/wordml" xmlns:wps="http://schemas.microsoft.com/office/word/2010/wordprocessingShape" mc:Ignorable="w14 w15 w16se w16cid w16 w16cex w16sdtdh w16sdtfl w16du wp14">
+<w:ftr xmlns:wpc="http://schemas.microsoft.com/office/word/2010/wordprocessingCanvas" xmlns:cx="http://schemas.microsoft.com/office/drawing/2014/chartex" xmlns:cx1="http://schemas.microsoft.com/office/drawing/2015/9/8/chartex" xmlns:cx2="http://schemas.microsoft.com/office/drawing/2015/10/21/chartex" xmlns:cx3="http://schemas.microsoft.com/office/drawing/2016/5/9/chartex" xmlns:cx4="http://schemas.microsoft.com/office/drawing/2016/5/10/chartex" xmlns:cx5="http://schemas.microsoft.com/office/drawing/2016/5/11/chartex" xmlns:cx6="http://schemas.microsoft.com/office/drawing/2016/5/12/chartex" xmlns:cx7="http://schemas.microsoft.com/office/drawing/2016/5/13/chartex" xmlns:cx8="http://schemas.microsoft.com/office/drawing/2016/5/14/chartex" xmlns:mc="http://schemas.openxmlformats.org/markup-compatibility/2006" xmlns:aink="http://schemas.microsoft.com/office/drawing/2016/ink" xmlns:am3d="http://schemas.microsoft.com/office/drawing/2017/model3d" xmlns:o="urn:schemas-microsoft-com:office:office" xmlns:oel="http://schemas.microsoft.com/office/2019/extlst" xmlns:r="http://schemas.openxmlformats.org/officeDocument/2006/relationships" xmlns:m="http://schemas.openxmlformats.org/officeDocument/2006/math" xmlns:v="urn:schemas-microsoft-com:vml" xmlns:wp14="http://schemas.microsoft.com/office/word/2010/wordprocessingDrawing" xmlns:wp="http://schemas.openxmlformats.org/drawingml/2006/wordprocessingDrawing" xmlns:w10="urn:schemas-microsoft-com:office:word" xmlns:w="http://schemas.openxmlformats.org/wordprocessingml/2006/main" xmlns:w14="http://schemas.microsoft.com/office/word/2010/wordml" xmlns:w15="http://schemas.microsoft.com/office/word/2012/wordml" xmlns:w16cei="http://schemas.microsoft.com/office/word/2026/wordml/cei" xmlns:w16cex="http://schemas.microsoft.com/office/word/2018/wordml/cex" xmlns:w16cid="http://schemas.microsoft.com/office/word/2016/wordml/cid" xmlns:w16="http://schemas.microsoft.com/office/word/2018/wordml" xmlns:w16du="http://schemas.microsoft.com/office/word/2023/wordml/word16du" xmlns:w16sdtdh="http://schemas.microsoft.com/office/word/2020/wordml/sdtdatahash" xmlns:w16sdtfl="http://schemas.microsoft.com/office/word/2024/wordml/sdtformatlock" xmlns:w16se="http://schemas.microsoft.com/office/word/2015/wordml/symex" xmlns:wpg="http://schemas.microsoft.com/office/word/2010/wordprocessingGroup" xmlns:wpi="http://schemas.microsoft.com/office/word/2010/wordprocessingInk" xmlns:wne="http://schemas.microsoft.com/office/word/2006/wordml" xmlns:wps="http://schemas.microsoft.com/office/word/2010/wordprocessingShape" mc:Ignorable="w14 w15 w16se w16cid w16 w16cex w16sdtdh w16sdtfl w16du wp14">
   <w:p>
     <w:pPr>
       <w:pStyle w:val="Pieddepage"/>
@@ -866,7 +866,7 @@
       <w:rPr>
         <w:noProof/>
       </w:rPr>
-      <w:t>25/08/2026</w:t>
+      <w:t>26/08/2026</w:t>
     </w:r>
     <w:r>
       <w:fldChar w:fldCharType="end"/>
@@ -894,7 +894,7 @@
 </file>
 
 <file path=word/footer2.xml><?xml version="1.0" encoding="utf-8"?>
-<w:ftr xmlns:wpc="http://schemas.microsoft.com/office/word/2010/wordprocessingCanvas" xmlns:cx="http://schemas.microsoft.com/office/drawing/2014/chartex" xmlns:cx1="http://schemas.microsoft.com/office/drawing/2015/9/8/chartex" xmlns:cx2="http://schemas.microsoft.com/office/drawing/2015/10/21/chartex" xmlns:cx3="http://schemas.microsoft.com/office/drawing/2016/5/9/chartex" xmlns:cx4="http://schemas.microsoft.com/office/drawing/2016/5/10/chartex" xmlns:cx5="http://schemas.microsoft.com/office/drawing/2016/5/11/chartex" xmlns:cx6="http://schemas.microsoft.com/office/drawing/2016/5/12/chartex" xmlns:cx7="http://schemas.microsoft.com/office/drawing/2016/5/13/chartex" xmlns:cx8="http://schemas.microsoft.com/office/drawing/2016/5/14/chartex" xmlns:mc="http://schemas.openxmlformats.org/markup-compatibility/2006" xmlns:aink="http://schemas.microsoft.com/office/drawing/2016/ink" xmlns:am3d="http://schemas.microsoft.com/office/drawing/2017/model3d" xmlns:o="urn:schemas-microsoft-com:office:office" xmlns:oel="http://schemas.microsoft.com/office/2019/extlst" xmlns:r="http://schemas.openxmlformats.org/officeDocument/2006/relationships" xmlns:m="http://schemas.openxmlformats.org/officeDocument/2006/math" xmlns:v="urn:schemas-microsoft-com:vml" xmlns:wp14="http://schemas.microsoft.com/office/word/2010/wordprocessingDrawing" xmlns:wp="http://schemas.openxmlformats.org/drawingml/2006/wordprocessingDrawing" xmlns:w10="urn:schemas-microsoft-com:office:word" xmlns:w="http://schemas.openxmlformats.org/wordprocessingml/2006/main" xmlns:w14="http://schemas.microsoft.com/office/word/2010/wordml" xmlns:w15="http://schemas.microsoft.com/office/word/2012/wordml" xmlns:w16cex="http://schemas.microsoft.com/office/word/2018/wordml/cex" xmlns:w16cid="http://schemas.microsoft.com/office/word/2016/wordml/cid" xmlns:w16="http://schemas.microsoft.com/office/word/2018/wordml" xmlns:w16du="http://schemas.microsoft.com/office/word/2023/wordml/word16du" xmlns:w16sdtdh="http://schemas.microsoft.com/office/word/2020/wordml/sdtdatahash" xmlns:w16sdtfl="http://schemas.microsoft.com/office/word/2024/wordml/sdtformatlock" xmlns:w16se="http://schemas.microsoft.com/office/word/2015/wordml/symex" xmlns:wpg="http://schemas.microsoft.com/office/word/2010/wordprocessingGroup" xmlns:wpi="http://schemas.microsoft.com/office/word/2010/wordprocessingInk" xmlns:wne="http://schemas.microsoft.com/office/word/2006/wordml" xmlns:wps="http://schemas.microsoft.com/office/word/2010/wordprocessingShape" mc:Ignorable="w14 w15 w16se w16cid w16 w16cex w16sdtdh w16sdtfl w16du wp14">
+<w:ftr xmlns:wpc="http://schemas.microsoft.com/office/word/2010/wordprocessingCanvas" xmlns:cx="http://schemas.microsoft.com/office/drawing/2014/chartex" xmlns:cx1="http://schemas.microsoft.com/office/drawing/2015/9/8/chartex" xmlns:cx2="http://schemas.microsoft.com/office/drawing/2015/10/21/chartex" xmlns:cx3="http://schemas.microsoft.com/office/drawing/2016/5/9/chartex" xmlns:cx4="http://schemas.microsoft.com/office/drawing/2016/5/10/chartex" xmlns:cx5="http://schemas.microsoft.com/office/drawing/2016/5/11/chartex" xmlns:cx6="http://schemas.microsoft.com/office/drawing/2016/5/12/chartex" xmlns:cx7="http://schemas.microsoft.com/office/drawing/2016/5/13/chartex" xmlns:cx8="http://schemas.microsoft.com/office/drawing/2016/5/14/chartex" xmlns:mc="http://schemas.openxmlformats.org/markup-compatibility/2006" xmlns:aink="http://schemas.microsoft.com/office/drawing/2016/ink" xmlns:am3d="http://schemas.microsoft.com/office/drawing/2017/model3d" xmlns:o="urn:schemas-microsoft-com:office:office" xmlns:oel="http://schemas.microsoft.com/office/2019/extlst" xmlns:r="http://schemas.openxmlformats.org/officeDocument/2006/relationships" xmlns:m="http://schemas.openxmlformats.org/officeDocument/2006/math" xmlns:v="urn:schemas-microsoft-com:vml" xmlns:wp14="http://schemas.microsoft.com/office/word/2010/wordprocessingDrawing" xmlns:wp="http://schemas.openxmlformats.org/drawingml/2006/wordprocessingDrawing" xmlns:w10="urn:schemas-microsoft-com:office:word" xmlns:w="http://schemas.openxmlformats.org/wordprocessingml/2006/main" xmlns:w14="http://schemas.microsoft.com/office/word/2010/wordml" xmlns:w15="http://schemas.microsoft.com/office/word/2012/wordml" xmlns:w16cei="http://schemas.microsoft.com/office/word/2026/wordml/cei" xmlns:w16cex="http://schemas.microsoft.com/office/word/2018/wordml/cex" xmlns:w16cid="http://schemas.microsoft.com/office/word/2016/wordml/cid" xmlns:w16="http://schemas.microsoft.com/office/word/2018/wordml" xmlns:w16du="http://schemas.microsoft.com/office/word/2023/wordml/word16du" xmlns:w16sdtdh="http://schemas.microsoft.com/office/word/2020/wordml/sdtdatahash" xmlns:w16sdtfl="http://schemas.microsoft.com/office/word/2024/wordml/sdtformatlock" xmlns:w16se="http://schemas.microsoft.com/office/word/2015/wordml/symex" xmlns:wpg="http://schemas.microsoft.com/office/word/2010/wordprocessingGroup" xmlns:wpi="http://schemas.microsoft.com/office/word/2010/wordprocessingInk" xmlns:wne="http://schemas.microsoft.com/office/word/2006/wordml" xmlns:wps="http://schemas.microsoft.com/office/word/2010/wordprocessingShape" mc:Ignorable="w14 w15 w16se w16cid w16 w16cex w16sdtdh w16sdtfl w16du wp14">
   <w:p>
     <w:pPr>
       <w:pStyle w:val="Pieddepage"/>
@@ -907,7 +907,7 @@
 </file>
 
 <file path=word/footer3.xml><?xml version="1.0" encoding="utf-8"?>
-<w:ftr xmlns:wpc="http://schemas.microsoft.com/office/word/2010/wordprocessingCanvas" xmlns:cx="http://schemas.microsoft.com/office/drawing/2014/chartex" xmlns:cx1="http://schemas.microsoft.com/office/drawing/2015/9/8/chartex" xmlns:cx2="http://schemas.microsoft.com/office/drawing/2015/10/21/chartex" xmlns:cx3="http://schemas.microsoft.com/office/drawing/2016/5/9/chartex" xmlns:cx4="http://schemas.microsoft.com/office/drawing/2016/5/10/chartex" xmlns:cx5="http://schemas.microsoft.com/office/drawing/2016/5/11/chartex" xmlns:cx6="http://schemas.microsoft.com/office/drawing/2016/5/12/chartex" xmlns:cx7="http://schemas.microsoft.com/office/drawing/2016/5/13/chartex" xmlns:cx8="http://schemas.microsoft.com/office/drawing/2016/5/14/chartex" xmlns:mc="http://schemas.openxmlformats.org/markup-compatibility/2006" xmlns:aink="http://schemas.microsoft.com/office/drawing/2016/ink" xmlns:am3d="http://schemas.microsoft.com/office/drawing/2017/model3d" xmlns:o="urn:schemas-microsoft-com:office:office" xmlns:oel="http://schemas.microsoft.com/office/2019/extlst" xmlns:r="http://schemas.openxmlformats.org/officeDocument/2006/relationships" xmlns:m="http://schemas.openxmlformats.org/officeDocument/2006/math" xmlns:v="urn:schemas-microsoft-com:vml" xmlns:wp14="http://schemas.microsoft.com/office/word/2010/wordprocessingDrawing" xmlns:wp="http://schemas.openxmlformats.org/drawingml/2006/wordprocessingDrawing" xmlns:w10="urn:schemas-microsoft-com:office:word" xmlns:w="http://schemas.openxmlformats.org/wordprocessingml/2006/main" xmlns:w14="http://schemas.microsoft.com/office/word/2010/wordml" xmlns:w15="http://schemas.microsoft.com/office/word/2012/wordml" xmlns:w16cex="http://schemas.microsoft.com/office/word/2018/wordml/cex" xmlns:w16cid="http://schemas.microsoft.com/office/word/2016/wordml/cid" xmlns:w16="http://schemas.microsoft.com/office/word/2018/wordml" xmlns:w16du="http://schemas.microsoft.com/office/word/2023/wordml/word16du" xmlns:w16sdtdh="http://schemas.microsoft.com/office/word/2020/wordml/sdtdatahash" xmlns:w16sdtfl="http://schemas.microsoft.com/office/word/2024/wordml/sdtformatlock" xmlns:w16se="http://schemas.microsoft.com/office/word/2015/wordml/symex" xmlns:wpg="http://schemas.microsoft.com/office/word/2010/wordprocessingGroup" xmlns:wpi="http://schemas.microsoft.com/office/word/2010/wordprocessingInk" xmlns:wne="http://schemas.microsoft.com/office/word/2006/wordml" xmlns:wps="http://schemas.microsoft.com/office/word/2010/wordprocessingShape" mc:Ignorable="w14 w15 w16se w16cid w16 w16cex w16sdtdh w16sdtfl w16du wp14">
+<w:ftr xmlns:wpc="http://schemas.microsoft.com/office/word/2010/wordprocessingCanvas" xmlns:cx="http://schemas.microsoft.com/office/drawing/2014/chartex" xmlns:cx1="http://schemas.microsoft.com/office/drawing/2015/9/8/chartex" xmlns:cx2="http://schemas.microsoft.com/office/drawing/2015/10/21/chartex" xmlns:cx3="http://schemas.microsoft.com/office/drawing/2016/5/9/chartex" xmlns:cx4="http://schemas.microsoft.com/office/drawing/2016/5/10/chartex" xmlns:cx5="http://schemas.microsoft.com/office/drawing/2016/5/11/chartex" xmlns:cx6="http://schemas.microsoft.com/office/drawing/2016/5/12/chartex" xmlns:cx7="http://schemas.microsoft.com/office/drawing/2016/5/13/chartex" xmlns:cx8="http://schemas.microsoft.com/office/drawing/2016/5/14/chartex" xmlns:mc="http://schemas.openxmlformats.org/markup-compatibility/2006" xmlns:aink="http://schemas.microsoft.com/office/drawing/2016/ink" xmlns:am3d="http://schemas.microsoft.com/office/drawing/2017/model3d" xmlns:o="urn:schemas-microsoft-com:office:office" xmlns:oel="http://schemas.microsoft.com/office/2019/extlst" xmlns:r="http://schemas.openxmlformats.org/officeDocument/2006/relationships" xmlns:m="http://schemas.openxmlformats.org/officeDocument/2006/math" xmlns:v="urn:schemas-microsoft-com:vml" xmlns:wp14="http://schemas.microsoft.com/office/word/2010/wordprocessingDrawing" xmlns:wp="http://schemas.openxmlformats.org/drawingml/2006/wordprocessingDrawing" xmlns:w10="urn:schemas-microsoft-com:office:word" xmlns:w="http://schemas.openxmlformats.org/wordprocessingml/2006/main" xmlns:w14="http://schemas.microsoft.com/office/word/2010/wordml" xmlns:w15="http://schemas.microsoft.com/office/word/2012/wordml" xmlns:w16cei="http://schemas.microsoft.com/office/word/2026/wordml/cei" xmlns:w16cex="http://schemas.microsoft.com/office/word/2018/wordml/cex" xmlns:w16cid="http://schemas.microsoft.com/office/word/2016/wordml/cid" xmlns:w16="http://schemas.microsoft.com/office/word/2018/wordml" xmlns:w16du="http://schemas.microsoft.com/office/word/2023/wordml/word16du" xmlns:w16sdtdh="http://schemas.microsoft.com/office/word/2020/wordml/sdtdatahash" xmlns:w16sdtfl="http://schemas.microsoft.com/office/word/2024/wordml/sdtformatlock" xmlns:w16se="http://schemas.microsoft.com/office/word/2015/wordml/symex" xmlns:wpg="http://schemas.microsoft.com/office/word/2010/wordprocessingGroup" xmlns:wpi="http://schemas.microsoft.com/office/word/2010/wordprocessingInk" xmlns:wne="http://schemas.microsoft.com/office/word/2006/wordml" xmlns:wps="http://schemas.microsoft.com/office/word/2010/wordprocessingShape" mc:Ignorable="w14 w15 w16se w16cid w16 w16cex w16sdtdh w16sdtfl w16du wp14">
   <w:p>
     <w:pPr>
       <w:pStyle w:val="Pieddepage"/>
@@ -1005,7 +1005,7 @@
 </file>
 
 <file path=word/footnotes.xml><?xml version="1.0" encoding="utf-8"?>
-<w:footnotes xmlns:wpc="http://schemas.microsoft.com/office/word/2010/wordprocessingCanvas" xmlns:cx="http://schemas.microsoft.com/office/drawing/2014/chartex" xmlns:cx1="http://schemas.microsoft.com/office/drawing/2015/9/8/chartex" xmlns:cx2="http://schemas.microsoft.com/office/drawing/2015/10/21/chartex" xmlns:cx3="http://schemas.microsoft.com/office/drawing/2016/5/9/chartex" xmlns:cx4="http://schemas.microsoft.com/office/drawing/2016/5/10/chartex" xmlns:cx5="http://schemas.microsoft.com/office/drawing/2016/5/11/chartex" xmlns:cx6="http://schemas.microsoft.com/office/drawing/2016/5/12/chartex" xmlns:cx7="http://schemas.microsoft.com/office/drawing/2016/5/13/chartex" xmlns:cx8="http://schemas.microsoft.com/office/drawing/2016/5/14/chartex" xmlns:mc="http://schemas.openxmlformats.org/markup-compatibility/2006" xmlns:aink="http://schemas.microsoft.com/office/drawing/2016/ink" xmlns:am3d="http://schemas.microsoft.com/office/drawing/2017/model3d" xmlns:o="urn:schemas-microsoft-com:office:office" xmlns:oel="http://schemas.microsoft.com/office/2019/extlst" xmlns:r="http://schemas.openxmlformats.org/officeDocument/2006/relationships" xmlns:m="http://schemas.openxmlformats.org/officeDocument/2006/math" xmlns:v="urn:schemas-microsoft-com:vml" xmlns:wp14="http://schemas.microsoft.com/office/word/2010/wordprocessingDrawing" xmlns:wp="http://schemas.openxmlformats.org/drawingml/2006/wordprocessingDrawing" xmlns:w10="urn:schemas-microsoft-com:office:word" xmlns:w="http://schemas.openxmlformats.org/wordprocessingml/2006/main" xmlns:w14="http://schemas.microsoft.com/office/word/2010/wordml" xmlns:w15="http://schemas.microsoft.com/office/word/2012/wordml" xmlns:w16cex="http://schemas.microsoft.com/office/word/2018/wordml/cex" xmlns:w16cid="http://schemas.microsoft.com/office/word/2016/wordml/cid" xmlns:w16="http://schemas.microsoft.com/office/word/2018/wordml" xmlns:w16du="http://schemas.microsoft.com/office/word/2023/wordml/word16du" xmlns:w16sdtdh="http://schemas.microsoft.com/office/word/2020/wordml/sdtdatahash" xmlns:w16sdtfl="http://schemas.microsoft.com/office/word/2024/wordml/sdtformatlock" xmlns:w16se="http://schemas.microsoft.com/office/word/2015/wordml/symex" xmlns:wpg="http://schemas.microsoft.com/office/word/2010/wordprocessingGroup" xmlns:wpi="http://schemas.microsoft.com/office/word/2010/wordprocessingInk" xmlns:wne="http://schemas.microsoft.com/office/word/2006/wordml" xmlns:wps="http://schemas.microsoft.com/office/word/2010/wordprocessingShape" mc:Ignorable="w14 w15 w16se w16cid w16 w16cex w16sdtdh w16sdtfl w16du wp14">
+<w:footnotes xmlns:wpc="http://schemas.microsoft.com/office/word/2010/wordprocessingCanvas" xmlns:cx="http://schemas.microsoft.com/office/drawing/2014/chartex" xmlns:cx1="http://schemas.microsoft.com/office/drawing/2015/9/8/chartex" xmlns:cx2="http://schemas.microsoft.com/office/drawing/2015/10/21/chartex" xmlns:cx3="http://schemas.microsoft.com/office/drawing/2016/5/9/chartex" xmlns:cx4="http://schemas.microsoft.com/office/drawing/2016/5/10/chartex" xmlns:cx5="http://schemas.microsoft.com/office/drawing/2016/5/11/chartex" xmlns:cx6="http://schemas.microsoft.com/office/drawing/2016/5/12/chartex" xmlns:cx7="http://schemas.microsoft.com/office/drawing/2016/5/13/chartex" xmlns:cx8="http://schemas.microsoft.com/office/drawing/2016/5/14/chartex" xmlns:mc="http://schemas.openxmlformats.org/markup-compatibility/2006" xmlns:aink="http://schemas.microsoft.com/office/drawing/2016/ink" xmlns:am3d="http://schemas.microsoft.com/office/drawing/2017/model3d" xmlns:o="urn:schemas-microsoft-com:office:office" xmlns:oel="http://schemas.microsoft.com/office/2019/extlst" xmlns:r="http://schemas.openxmlformats.org/officeDocument/2006/relationships" xmlns:m="http://schemas.openxmlformats.org/officeDocument/2006/math" xmlns:v="urn:schemas-microsoft-com:vml" xmlns:wp14="http://schemas.microsoft.com/office/word/2010/wordprocessingDrawing" xmlns:wp="http://schemas.openxmlformats.org/drawingml/2006/wordprocessingDrawing" xmlns:w10="urn:schemas-microsoft-com:office:word" xmlns:w="http://schemas.openxmlformats.org/wordprocessingml/2006/main" xmlns:w14="http://schemas.microsoft.com/office/word/2010/wordml" xmlns:w15="http://schemas.microsoft.com/office/word/2012/wordml" xmlns:w16cei="http://schemas.microsoft.com/office/word/2026/wordml/cei" xmlns:w16cex="http://schemas.microsoft.com/office/word/2018/wordml/cex" xmlns:w16cid="http://schemas.microsoft.com/office/word/2016/wordml/cid" xmlns:w16="http://schemas.microsoft.com/office/word/2018/wordml" xmlns:w16du="http://schemas.microsoft.com/office/word/2023/wordml/word16du" xmlns:w16sdtdh="http://schemas.microsoft.com/office/word/2020/wordml/sdtdatahash" xmlns:w16sdtfl="http://schemas.microsoft.com/office/word/2024/wordml/sdtformatlock" xmlns:w16se="http://schemas.microsoft.com/office/word/2015/wordml/symex" xmlns:wpg="http://schemas.microsoft.com/office/word/2010/wordprocessingGroup" xmlns:wpi="http://schemas.microsoft.com/office/word/2010/wordprocessingInk" xmlns:wne="http://schemas.microsoft.com/office/word/2006/wordml" xmlns:wps="http://schemas.microsoft.com/office/word/2010/wordprocessingShape" mc:Ignorable="w14 w15 w16se w16cid w16 w16cex w16sdtdh w16sdtfl w16du wp14">
   <w:footnote w:type="separator" w:id="-1">
     <w:p>
       <w:pPr>
@@ -1033,7 +1033,7 @@
 </file>
 
 <file path=word/header1.xml><?xml version="1.0" encoding="utf-8"?>
-<w:hdr xmlns:wpc="http://schemas.microsoft.com/office/word/2010/wordprocessingCanvas" xmlns:cx="http://schemas.microsoft.com/office/drawing/2014/chartex" xmlns:cx1="http://schemas.microsoft.com/office/drawing/2015/9/8/chartex" xmlns:cx2="http://schemas.microsoft.com/office/drawing/2015/10/21/chartex" xmlns:cx3="http://schemas.microsoft.com/office/drawing/2016/5/9/chartex" xmlns:cx4="http://schemas.microsoft.com/office/drawing/2016/5/10/chartex" xmlns:cx5="http://schemas.microsoft.com/office/drawing/2016/5/11/chartex" xmlns:cx6="http://schemas.microsoft.com/office/drawing/2016/5/12/chartex" xmlns:cx7="http://schemas.microsoft.com/office/drawing/2016/5/13/chartex" xmlns:cx8="http://schemas.microsoft.com/office/drawing/2016/5/14/chartex" xmlns:mc="http://schemas.openxmlformats.org/markup-compatibility/2006" xmlns:aink="http://schemas.microsoft.com/office/drawing/2016/ink" xmlns:am3d="http://schemas.microsoft.com/office/drawing/2017/model3d" xmlns:o="urn:schemas-microsoft-com:office:office" xmlns:oel="http://schemas.microsoft.com/office/2019/extlst" xmlns:r="http://schemas.openxmlformats.org/officeDocument/2006/relationships" xmlns:m="http://schemas.openxmlformats.org/officeDocument/2006/math" xmlns:v="urn:schemas-microsoft-com:vml" xmlns:wp14="http://schemas.microsoft.com/office/word/2010/wordprocessingDrawing" xmlns:wp="http://schemas.openxmlformats.org/drawingml/2006/wordprocessingDrawing" xmlns:w10="urn:schemas-microsoft-com:office:word" xmlns:w="http://schemas.openxmlformats.org/wordprocessingml/2006/main" xmlns:w14="http://schemas.microsoft.com/office/word/2010/wordml" xmlns:w15="http://schemas.microsoft.com/office/word/2012/wordml" xmlns:w16cex="http://schemas.microsoft.com/office/word/2018/wordml/cex" xmlns:w16cid="http://schemas.microsoft.com/office/word/2016/wordml/cid" xmlns:w16="http://schemas.microsoft.com/office/word/2018/wordml" xmlns:w16du="http://schemas.microsoft.com/office/word/2023/wordml/word16du" xmlns:w16sdtdh="http://schemas.microsoft.com/office/word/2020/wordml/sdtdatahash" xmlns:w16sdtfl="http://schemas.microsoft.com/office/word/2024/wordml/sdtformatlock" xmlns:w16se="http://schemas.microsoft.com/office/word/2015/wordml/symex" xmlns:wpg="http://schemas.microsoft.com/office/word/2010/wordprocessingGroup" xmlns:wpi="http://schemas.microsoft.com/office/word/2010/wordprocessingInk" xmlns:wne="http://schemas.microsoft.com/office/word/2006/wordml" xmlns:wps="http://schemas.microsoft.com/office/word/2010/wordprocessingShape" mc:Ignorable="w14 w15 w16se w16cid w16 w16cex w16sdtdh w16sdtfl w16du wp14">
+<w:hdr xmlns:wpc="http://schemas.microsoft.com/office/word/2010/wordprocessingCanvas" xmlns:cx="http://schemas.microsoft.com/office/drawing/2014/chartex" xmlns:cx1="http://schemas.microsoft.com/office/drawing/2015/9/8/chartex" xmlns:cx2="http://schemas.microsoft.com/office/drawing/2015/10/21/chartex" xmlns:cx3="http://schemas.microsoft.com/office/drawing/2016/5/9/chartex" xmlns:cx4="http://schemas.microsoft.com/office/drawing/2016/5/10/chartex" xmlns:cx5="http://schemas.microsoft.com/office/drawing/2016/5/11/chartex" xmlns:cx6="http://schemas.microsoft.com/office/drawing/2016/5/12/chartex" xmlns:cx7="http://schemas.microsoft.com/office/drawing/2016/5/13/chartex" xmlns:cx8="http://schemas.microsoft.com/office/drawing/2016/5/14/chartex" xmlns:mc="http://schemas.openxmlformats.org/markup-compatibility/2006" xmlns:aink="http://schemas.microsoft.com/office/drawing/2016/ink" xmlns:am3d="http://schemas.microsoft.com/office/drawing/2017/model3d" xmlns:o="urn:schemas-microsoft-com:office:office" xmlns:oel="http://schemas.microsoft.com/office/2019/extlst" xmlns:r="http://schemas.openxmlformats.org/officeDocument/2006/relationships" xmlns:m="http://schemas.openxmlformats.org/officeDocument/2006/math" xmlns:v="urn:schemas-microsoft-com:vml" xmlns:wp14="http://schemas.microsoft.com/office/word/2010/wordprocessingDrawing" xmlns:wp="http://schemas.openxmlformats.org/drawingml/2006/wordprocessingDrawing" xmlns:w10="urn:schemas-microsoft-com:office:word" xmlns:w="http://schemas.openxmlformats.org/wordprocessingml/2006/main" xmlns:w14="http://schemas.microsoft.com/office/word/2010/wordml" xmlns:w15="http://schemas.microsoft.com/office/word/2012/wordml" xmlns:w16cei="http://schemas.microsoft.com/office/word/2026/wordml/cei" xmlns:w16cex="http://schemas.microsoft.com/office/word/2018/wordml/cex" xmlns:w16cid="http://schemas.microsoft.com/office/word/2016/wordml/cid" xmlns:w16="http://schemas.microsoft.com/office/word/2018/wordml" xmlns:w16du="http://schemas.microsoft.com/office/word/2023/wordml/word16du" xmlns:w16sdtdh="http://schemas.microsoft.com/office/word/2020/wordml/sdtdatahash" xmlns:w16sdtfl="http://schemas.microsoft.com/office/word/2024/wordml/sdtformatlock" xmlns:w16se="http://schemas.microsoft.com/office/word/2015/wordml/symex" xmlns:wpg="http://schemas.microsoft.com/office/word/2010/wordprocessingGroup" xmlns:wpi="http://schemas.microsoft.com/office/word/2010/wordprocessingInk" xmlns:wne="http://schemas.microsoft.com/office/word/2006/wordml" xmlns:wps="http://schemas.microsoft.com/office/word/2010/wordprocessingShape" mc:Ignorable="w14 w15 w16se w16cid w16 w16cex w16sdtdh w16sdtfl w16du wp14">
   <w:p>
     <w:pPr>
       <w:tabs>
@@ -1108,7 +1108,7 @@
 </file>
 
 <file path=word/header2.xml><?xml version="1.0" encoding="utf-8"?>
-<w:hdr xmlns:wpc="http://schemas.microsoft.com/office/word/2010/wordprocessingCanvas" xmlns:cx="http://schemas.microsoft.com/office/drawing/2014/chartex" xmlns:cx1="http://schemas.microsoft.com/office/drawing/2015/9/8/chartex" xmlns:cx2="http://schemas.microsoft.com/office/drawing/2015/10/21/chartex" xmlns:cx3="http://schemas.microsoft.com/office/drawing/2016/5/9/chartex" xmlns:cx4="http://schemas.microsoft.com/office/drawing/2016/5/10/chartex" xmlns:cx5="http://schemas.microsoft.com/office/drawing/2016/5/11/chartex" xmlns:cx6="http://schemas.microsoft.com/office/drawing/2016/5/12/chartex" xmlns:cx7="http://schemas.microsoft.com/office/drawing/2016/5/13/chartex" xmlns:cx8="http://schemas.microsoft.com/office/drawing/2016/5/14/chartex" xmlns:mc="http://schemas.openxmlformats.org/markup-compatibility/2006" xmlns:aink="http://schemas.microsoft.com/office/drawing/2016/ink" xmlns:am3d="http://schemas.microsoft.com/office/drawing/2017/model3d" xmlns:o="urn:schemas-microsoft-com:office:office" xmlns:oel="http://schemas.microsoft.com/office/2019/extlst" xmlns:r="http://schemas.openxmlformats.org/officeDocument/2006/relationships" xmlns:m="http://schemas.openxmlformats.org/officeDocument/2006/math" xmlns:v="urn:schemas-microsoft-com:vml" xmlns:wp14="http://schemas.microsoft.com/office/word/2010/wordprocessingDrawing" xmlns:wp="http://schemas.openxmlformats.org/drawingml/2006/wordprocessingDrawing" xmlns:w10="urn:schemas-microsoft-com:office:word" xmlns:w="http://schemas.openxmlformats.org/wordprocessingml/2006/main" xmlns:w14="http://schemas.microsoft.com/office/word/2010/wordml" xmlns:w15="http://schemas.microsoft.com/office/word/2012/wordml" xmlns:w16cex="http://schemas.microsoft.com/office/word/2018/wordml/cex" xmlns:w16cid="http://schemas.microsoft.com/office/word/2016/wordml/cid" xmlns:w16="http://schemas.microsoft.com/office/word/2018/wordml" xmlns:w16du="http://schemas.microsoft.com/office/word/2023/wordml/word16du" xmlns:w16sdtdh="http://schemas.microsoft.com/office/word/2020/wordml/sdtdatahash" xmlns:w16sdtfl="http://schemas.microsoft.com/office/word/2024/wordml/sdtformatlock" xmlns:w16se="http://schemas.microsoft.com/office/word/2015/wordml/symex" xmlns:wpg="http://schemas.microsoft.com/office/word/2010/wordprocessingGroup" xmlns:wpi="http://schemas.microsoft.com/office/word/2010/wordprocessingInk" xmlns:wne="http://schemas.microsoft.com/office/word/2006/wordml" xmlns:wps="http://schemas.microsoft.com/office/word/2010/wordprocessingShape" mc:Ignorable="w14 w15 w16se w16cid w16 w16cex w16sdtdh w16sdtfl w16du wp14">
+<w:hdr xmlns:wpc="http://schemas.microsoft.com/office/word/2010/wordprocessingCanvas" xmlns:cx="http://schemas.microsoft.com/office/drawing/2014/chartex" xmlns:cx1="http://schemas.microsoft.com/office/drawing/2015/9/8/chartex" xmlns:cx2="http://schemas.microsoft.com/office/drawing/2015/10/21/chartex" xmlns:cx3="http://schemas.microsoft.com/office/drawing/2016/5/9/chartex" xmlns:cx4="http://schemas.microsoft.com/office/drawing/2016/5/10/chartex" xmlns:cx5="http://schemas.microsoft.com/office/drawing/2016/5/11/chartex" xmlns:cx6="http://schemas.microsoft.com/office/drawing/2016/5/12/chartex" xmlns:cx7="http://schemas.microsoft.com/office/drawing/2016/5/13/chartex" xmlns:cx8="http://schemas.microsoft.com/office/drawing/2016/5/14/chartex" xmlns:mc="http://schemas.openxmlformats.org/markup-compatibility/2006" xmlns:aink="http://schemas.microsoft.com/office/drawing/2016/ink" xmlns:am3d="http://schemas.microsoft.com/office/drawing/2017/model3d" xmlns:o="urn:schemas-microsoft-com:office:office" xmlns:oel="http://schemas.microsoft.com/office/2019/extlst" xmlns:r="http://schemas.openxmlformats.org/officeDocument/2006/relationships" xmlns:m="http://schemas.openxmlformats.org/officeDocument/2006/math" xmlns:v="urn:schemas-microsoft-com:vml" xmlns:wp14="http://schemas.microsoft.com/office/word/2010/wordprocessingDrawing" xmlns:wp="http://schemas.openxmlformats.org/drawingml/2006/wordprocessingDrawing" xmlns:w10="urn:schemas-microsoft-com:office:word" xmlns:w="http://schemas.openxmlformats.org/wordprocessingml/2006/main" xmlns:w14="http://schemas.microsoft.com/office/word/2010/wordml" xmlns:w15="http://schemas.microsoft.com/office/word/2012/wordml" xmlns:w16cei="http://schemas.microsoft.com/office/word/2026/wordml/cei" xmlns:w16cex="http://schemas.microsoft.com/office/word/2018/wordml/cex" xmlns:w16cid="http://schemas.microsoft.com/office/word/2016/wordml/cid" xmlns:w16="http://schemas.microsoft.com/office/word/2018/wordml" xmlns:w16du="http://schemas.microsoft.com/office/word/2023/wordml/word16du" xmlns:w16sdtdh="http://schemas.microsoft.com/office/word/2020/wordml/sdtdatahash" xmlns:w16sdtfl="http://schemas.microsoft.com/office/word/2024/wordml/sdtformatlock" xmlns:w16se="http://schemas.microsoft.com/office/word/2015/wordml/symex" xmlns:wpg="http://schemas.microsoft.com/office/word/2010/wordprocessingGroup" xmlns:wpi="http://schemas.microsoft.com/office/word/2010/wordprocessingInk" xmlns:wne="http://schemas.microsoft.com/office/word/2006/wordml" xmlns:wps="http://schemas.microsoft.com/office/word/2010/wordprocessingShape" mc:Ignorable="w14 w15 w16se w16cid w16 w16cex w16sdtdh w16sdtfl w16du wp14">
   <w:p>
     <w:pPr>
       <w:pStyle w:val="En-tte"/>
@@ -1360,7 +1360,7 @@
 </file>
 
 <file path=word/header3.xml><?xml version="1.0" encoding="utf-8"?>
-<w:hdr xmlns:wpc="http://schemas.microsoft.com/office/word/2010/wordprocessingCanvas" xmlns:cx="http://schemas.microsoft.com/office/drawing/2014/chartex" xmlns:cx1="http://schemas.microsoft.com/office/drawing/2015/9/8/chartex" xmlns:cx2="http://schemas.microsoft.com/office/drawing/2015/10/21/chartex" xmlns:cx3="http://schemas.microsoft.com/office/drawing/2016/5/9/chartex" xmlns:cx4="http://schemas.microsoft.com/office/drawing/2016/5/10/chartex" xmlns:cx5="http://schemas.microsoft.com/office/drawing/2016/5/11/chartex" xmlns:cx6="http://schemas.microsoft.com/office/drawing/2016/5/12/chartex" xmlns:cx7="http://schemas.microsoft.com/office/drawing/2016/5/13/chartex" xmlns:cx8="http://schemas.microsoft.com/office/drawing/2016/5/14/chartex" xmlns:mc="http://schemas.openxmlformats.org/markup-compatibility/2006" xmlns:aink="http://schemas.microsoft.com/office/drawing/2016/ink" xmlns:am3d="http://schemas.microsoft.com/office/drawing/2017/model3d" xmlns:o="urn:schemas-microsoft-com:office:office" xmlns:oel="http://schemas.microsoft.com/office/2019/extlst" xmlns:r="http://schemas.openxmlformats.org/officeDocument/2006/relationships" xmlns:m="http://schemas.openxmlformats.org/officeDocument/2006/math" xmlns:v="urn:schemas-microsoft-com:vml" xmlns:wp14="http://schemas.microsoft.com/office/word/2010/wordprocessingDrawing" xmlns:wp="http://schemas.openxmlformats.org/drawingml/2006/wordprocessingDrawing" xmlns:w10="urn:schemas-microsoft-com:office:word" xmlns:w="http://schemas.openxmlformats.org/wordprocessingml/2006/main" xmlns:w14="http://schemas.microsoft.com/office/word/2010/wordml" xmlns:w15="http://schemas.microsoft.com/office/word/2012/wordml" xmlns:w16cex="http://schemas.microsoft.com/office/word/2018/wordml/cex" xmlns:w16cid="http://schemas.microsoft.com/office/word/2016/wordml/cid" xmlns:w16="http://schemas.microsoft.com/office/word/2018/wordml" xmlns:w16du="http://schemas.microsoft.com/office/word/2023/wordml/word16du" xmlns:w16sdtdh="http://schemas.microsoft.com/office/word/2020/wordml/sdtdatahash" xmlns:w16sdtfl="http://schemas.microsoft.com/office/word/2024/wordml/sdtformatlock" xmlns:w16se="http://schemas.microsoft.com/office/word/2015/wordml/symex" xmlns:wpg="http://schemas.microsoft.com/office/word/2010/wordprocessingGroup" xmlns:wpi="http://schemas.microsoft.com/office/word/2010/wordprocessingInk" xmlns:wne="http://schemas.microsoft.com/office/word/2006/wordml" xmlns:wps="http://schemas.microsoft.com/office/word/2010/wordprocessingShape" mc:Ignorable="w14 w15 w16se w16cid w16 w16cex w16sdtdh w16sdtfl w16du wp14">
+<w:hdr xmlns:wpc="http://schemas.microsoft.com/office/word/2010/wordprocessingCanvas" xmlns:cx="http://schemas.microsoft.com/office/drawing/2014/chartex" xmlns:cx1="http://schemas.microsoft.com/office/drawing/2015/9/8/chartex" xmlns:cx2="http://schemas.microsoft.com/office/drawing/2015/10/21/chartex" xmlns:cx3="http://schemas.microsoft.com/office/drawing/2016/5/9/chartex" xmlns:cx4="http://schemas.microsoft.com/office/drawing/2016/5/10/chartex" xmlns:cx5="http://schemas.microsoft.com/office/drawing/2016/5/11/chartex" xmlns:cx6="http://schemas.microsoft.com/office/drawing/2016/5/12/chartex" xmlns:cx7="http://schemas.microsoft.com/office/drawing/2016/5/13/chartex" xmlns:cx8="http://schemas.microsoft.com/office/drawing/2016/5/14/chartex" xmlns:mc="http://schemas.openxmlformats.org/markup-compatibility/2006" xmlns:aink="http://schemas.microsoft.com/office/drawing/2016/ink" xmlns:am3d="http://schemas.microsoft.com/office/drawing/2017/model3d" xmlns:o="urn:schemas-microsoft-com:office:office" xmlns:oel="http://schemas.microsoft.com/office/2019/extlst" xmlns:r="http://schemas.openxmlformats.org/officeDocument/2006/relationships" xmlns:m="http://schemas.openxmlformats.org/officeDocument/2006/math" xmlns:v="urn:schemas-microsoft-com:vml" xmlns:wp14="http://schemas.microsoft.com/office/word/2010/wordprocessingDrawing" xmlns:wp="http://schemas.openxmlformats.org/drawingml/2006/wordprocessingDrawing" xmlns:w10="urn:schemas-microsoft-com:office:word" xmlns:w="http://schemas.openxmlformats.org/wordprocessingml/2006/main" xmlns:w14="http://schemas.microsoft.com/office/word/2010/wordml" xmlns:w15="http://schemas.microsoft.com/office/word/2012/wordml" xmlns:w16cei="http://schemas.microsoft.com/office/word/2026/wordml/cei" xmlns:w16cex="http://schemas.microsoft.com/office/word/2018/wordml/cex" xmlns:w16cid="http://schemas.microsoft.com/office/word/2016/wordml/cid" xmlns:w16="http://schemas.microsoft.com/office/word/2018/wordml" xmlns:w16du="http://schemas.microsoft.com/office/word/2023/wordml/word16du" xmlns:w16sdtdh="http://schemas.microsoft.com/office/word/2020/wordml/sdtdatahash" xmlns:w16sdtfl="http://schemas.microsoft.com/office/word/2024/wordml/sdtformatlock" xmlns:w16se="http://schemas.microsoft.com/office/word/2015/wordml/symex" xmlns:wpg="http://schemas.microsoft.com/office/word/2010/wordprocessingGroup" xmlns:wpi="http://schemas.microsoft.com/office/word/2010/wordprocessingInk" xmlns:wne="http://schemas.microsoft.com/office/word/2006/wordml" xmlns:wps="http://schemas.microsoft.com/office/word/2010/wordprocessingShape" mc:Ignorable="w14 w15 w16se w16cid w16 w16cex w16sdtdh w16sdtfl w16du wp14">
   <w:p>
     <w:pPr>
       <w:tabs>
@@ -1450,7 +1450,7 @@
 </file>
 
 <file path=word/numbering.xml><?xml version="1.0" encoding="utf-8"?>
-<w:numbering xmlns:wpc="http://schemas.microsoft.com/office/word/2010/wordprocessingCanvas" xmlns:cx="http://schemas.microsoft.com/office/drawing/2014/chartex" xmlns:cx1="http://schemas.microsoft.com/office/drawing/2015/9/8/chartex" xmlns:cx2="http://schemas.microsoft.com/office/drawing/2015/10/21/chartex" xmlns:cx3="http://schemas.microsoft.com/office/drawing/2016/5/9/chartex" xmlns:cx4="http://schemas.microsoft.com/office/drawing/2016/5/10/chartex" xmlns:cx5="http://schemas.microsoft.com/office/drawing/2016/5/11/chartex" xmlns:cx6="http://schemas.microsoft.com/office/drawing/2016/5/12/chartex" xmlns:cx7="http://schemas.microsoft.com/office/drawing/2016/5/13/chartex" xmlns:cx8="http://schemas.microsoft.com/office/drawing/2016/5/14/chartex" xmlns:mc="http://schemas.openxmlformats.org/markup-compatibility/2006" xmlns:aink="http://schemas.microsoft.com/office/drawing/2016/ink" xmlns:am3d="http://schemas.microsoft.com/office/drawing/2017/model3d" xmlns:o="urn:schemas-microsoft-com:office:office" xmlns:oel="http://schemas.microsoft.com/office/2019/extlst" xmlns:r="http://schemas.openxmlformats.org/officeDocument/2006/relationships" xmlns:m="http://schemas.openxmlformats.org/officeDocument/2006/math" xmlns:v="urn:schemas-microsoft-com:vml" xmlns:wp14="http://schemas.microsoft.com/office/word/2010/wordprocessingDrawing" xmlns:wp="http://schemas.openxmlformats.org/drawingml/2006/wordprocessingDrawing" xmlns:w10="urn:schemas-microsoft-com:office:word" xmlns:w="http://schemas.openxmlformats.org/wordprocessingml/2006/main" xmlns:w14="http://schemas.microsoft.com/office/word/2010/wordml" xmlns:w15="http://schemas.microsoft.com/office/word/2012/wordml" xmlns:w16cex="http://schemas.microsoft.com/office/word/2018/wordml/cex" xmlns:w16cid="http://schemas.microsoft.com/office/word/2016/wordml/cid" xmlns:w16="http://schemas.microsoft.com/office/word/2018/wordml" xmlns:w16du="http://schemas.microsoft.com/office/word/2023/wordml/word16du" xmlns:w16sdtdh="http://schemas.microsoft.com/office/word/2020/wordml/sdtdatahash" xmlns:w16sdtfl="http://schemas.microsoft.com/office/word/2024/wordml/sdtformatlock" xmlns:w16se="http://schemas.microsoft.com/office/word/2015/wordml/symex" xmlns:wpg="http://schemas.microsoft.com/office/word/2010/wordprocessingGroup" xmlns:wpi="http://schemas.microsoft.com/office/word/2010/wordprocessingInk" xmlns:wne="http://schemas.microsoft.com/office/word/2006/wordml" xmlns:wps="http://schemas.microsoft.com/office/word/2010/wordprocessingShape" mc:Ignorable="w14 w15 w16se w16cid w16 w16cex w16sdtdh w16sdtfl w16du wp14">
+<w:numbering xmlns:wpc="http://schemas.microsoft.com/office/word/2010/wordprocessingCanvas" xmlns:cx="http://schemas.microsoft.com/office/drawing/2014/chartex" xmlns:cx1="http://schemas.microsoft.com/office/drawing/2015/9/8/chartex" xmlns:cx2="http://schemas.microsoft.com/office/drawing/2015/10/21/chartex" xmlns:cx3="http://schemas.microsoft.com/office/drawing/2016/5/9/chartex" xmlns:cx4="http://schemas.microsoft.com/office/drawing/2016/5/10/chartex" xmlns:cx5="http://schemas.microsoft.com/office/drawing/2016/5/11/chartex" xmlns:cx6="http://schemas.microsoft.com/office/drawing/2016/5/12/chartex" xmlns:cx7="http://schemas.microsoft.com/office/drawing/2016/5/13/chartex" xmlns:cx8="http://schemas.microsoft.com/office/drawing/2016/5/14/chartex" xmlns:mc="http://schemas.openxmlformats.org/markup-compatibility/2006" xmlns:aink="http://schemas.microsoft.com/office/drawing/2016/ink" xmlns:am3d="http://schemas.microsoft.com/office/drawing/2017/model3d" xmlns:o="urn:schemas-microsoft-com:office:office" xmlns:oel="http://schemas.microsoft.com/office/2019/extlst" xmlns:r="http://schemas.openxmlformats.org/officeDocument/2006/relationships" xmlns:m="http://schemas.openxmlformats.org/officeDocument/2006/math" xmlns:v="urn:schemas-microsoft-com:vml" xmlns:wp14="http://schemas.microsoft.com/office/word/2010/wordprocessingDrawing" xmlns:wp="http://schemas.openxmlformats.org/drawingml/2006/wordprocessingDrawing" xmlns:w10="urn:schemas-microsoft-com:office:word" xmlns:w="http://schemas.openxmlformats.org/wordprocessingml/2006/main" xmlns:w14="http://schemas.microsoft.com/office/word/2010/wordml" xmlns:w15="http://schemas.microsoft.com/office/word/2012/wordml" xmlns:w16cei="http://schemas.microsoft.com/office/word/2026/wordml/cei" xmlns:w16cex="http://schemas.microsoft.com/office/word/2018/wordml/cex" xmlns:w16cid="http://schemas.microsoft.com/office/word/2016/wordml/cid" xmlns:w16="http://schemas.microsoft.com/office/word/2018/wordml" xmlns:w16du="http://schemas.microsoft.com/office/word/2023/wordml/word16du" xmlns:w16sdtdh="http://schemas.microsoft.com/office/word/2020/wordml/sdtdatahash" xmlns:w16sdtfl="http://schemas.microsoft.com/office/word/2024/wordml/sdtformatlock" xmlns:w16se="http://schemas.microsoft.com/office/word/2015/wordml/symex" xmlns:wpg="http://schemas.microsoft.com/office/word/2010/wordprocessingGroup" xmlns:wpi="http://schemas.microsoft.com/office/word/2010/wordprocessingInk" xmlns:wne="http://schemas.microsoft.com/office/word/2006/wordml" xmlns:wps="http://schemas.microsoft.com/office/word/2010/wordprocessingShape" mc:Ignorable="w14 w15 w16se w16cid w16 w16cex w16sdtdh w16sdtfl w16du wp14">
   <w:abstractNum w:abstractNumId="0" w15:restartNumberingAfterBreak="0">
     <w:nsid w:val="02F35C0C"/>
     <w:multiLevelType w:val="hybridMultilevel"/>
@@ -3103,12 +3103,13 @@
     <w:next w:val="Normal"/>
     <w:uiPriority w:val="9"/>
     <w:qFormat/>
-    <w:rsid w:val="00D007BA"/>
+    <w:rsid w:val="008A12A6"/>
     <w:pPr>
       <w:pageBreakBefore/>
       <w:numPr>
         <w:numId w:val="10"/>
       </w:numPr>
+      <w:ind w:left="431" w:hanging="431"/>
       <w:outlineLvl w:val="0"/>
     </w:pPr>
     <w:rPr>

</xml_diff>

<commit_message>
Id technique style 1pt + pas d'écart de paragraphe
</commit_message>
<xml_diff>
--- a/template-doc-pbib.docx
+++ b/template-doc-pbib.docx
@@ -790,18 +790,6 @@
         </w:p>
       </w:sdtContent>
     </w:sdt>
-    <w:p>
-      <w:pPr>
-        <w:suppressAutoHyphens w:val="0"/>
-        <w:spacing w:after="160" w:line="256" w:lineRule="auto"/>
-      </w:pPr>
-    </w:p>
-    <w:p>
-      <w:pPr>
-        <w:suppressAutoHyphens w:val="0"/>
-        <w:spacing w:after="160" w:line="256" w:lineRule="auto"/>
-      </w:pPr>
-    </w:p>
     <w:sectPr>
       <w:headerReference w:type="default" r:id="rId12"/>
       <w:footerReference w:type="default" r:id="rId13"/>
@@ -866,7 +854,7 @@
       <w:rPr>
         <w:noProof/>
       </w:rPr>
-      <w:t>26/08/2026</w:t>
+      <w:t>27/08/2026</w:t>
     </w:r>
     <w:r>
       <w:fldChar w:fldCharType="end"/>
@@ -4048,10 +4036,11 @@
     <w:name w:val="Id technique"/>
     <w:basedOn w:val="Policepardfaut"/>
     <w:qFormat/>
+    <w:rsid w:val="00E407B7"/>
     <w:rPr>
       <w:rFonts w:ascii="Consolas" w:hAnsi="Consolas"/>
       <w:color w:val="808080"/>
-      <w:sz w:val="16"/>
+      <w:sz w:val="2"/>
       <w:szCs w:val="16"/>
     </w:rPr>
   </w:style>

</xml_diff>